<commit_message>
Updated manual and changed specs to Win10 + Win11
</commit_message>
<xml_diff>
--- a/Yaml AudioTool Rebuilt/Resources/Yaml Audio Tool Rebuilt - Manual.docx
+++ b/Yaml AudioTool Rebuilt/Resources/Yaml Audio Tool Rebuilt - Manual.docx
@@ -1,6 +1,6 @@
 
 <file path=word/document.xml><?xml version="1.0" encoding="utf-8"?>
-<w:document xmlns:wpc="http://schemas.microsoft.com/office/word/2010/wordprocessingCanvas" xmlns:cx="http://schemas.microsoft.com/office/drawing/2014/chartex" xmlns:cx1="http://schemas.microsoft.com/office/drawing/2015/9/8/chartex" xmlns:mc="http://schemas.openxmlformats.org/markup-compatibility/2006" xmlns:o="urn:schemas-microsoft-com:office:office" xmlns:r="http://schemas.openxmlformats.org/officeDocument/2006/relationships" xmlns:m="http://schemas.openxmlformats.org/officeDocument/2006/math" xmlns:v="urn:schemas-microsoft-com:vml" xmlns:wp14="http://schemas.microsoft.com/office/word/2010/wordprocessingDrawing" xmlns:wp="http://schemas.openxmlformats.org/drawingml/2006/wordprocessingDrawing" xmlns:w10="urn:schemas-microsoft-com:office:word" xmlns:w="http://schemas.openxmlformats.org/wordprocessingml/2006/main" xmlns:w14="http://schemas.microsoft.com/office/word/2010/wordml" xmlns:w15="http://schemas.microsoft.com/office/word/2012/wordml" xmlns:w16se="http://schemas.microsoft.com/office/word/2015/wordml/symex" xmlns:wpg="http://schemas.microsoft.com/office/word/2010/wordprocessingGroup" xmlns:wpi="http://schemas.microsoft.com/office/word/2010/wordprocessingInk" xmlns:wne="http://schemas.microsoft.com/office/word/2006/wordml" xmlns:wps="http://schemas.microsoft.com/office/word/2010/wordprocessingShape" mc:Ignorable="w14 w15 w16se wp14">
+<w:document xmlns:wpc="http://schemas.microsoft.com/office/word/2010/wordprocessingCanvas" xmlns:cx="http://schemas.microsoft.com/office/drawing/2014/chartex" xmlns:cx1="http://schemas.microsoft.com/office/drawing/2015/9/8/chartex" xmlns:cx2="http://schemas.microsoft.com/office/drawing/2015/10/21/chartex" xmlns:cx3="http://schemas.microsoft.com/office/drawing/2016/5/9/chartex" xmlns:cx4="http://schemas.microsoft.com/office/drawing/2016/5/10/chartex" xmlns:cx5="http://schemas.microsoft.com/office/drawing/2016/5/11/chartex" xmlns:cx6="http://schemas.microsoft.com/office/drawing/2016/5/12/chartex" xmlns:cx7="http://schemas.microsoft.com/office/drawing/2016/5/13/chartex" xmlns:cx8="http://schemas.microsoft.com/office/drawing/2016/5/14/chartex" xmlns:mc="http://schemas.openxmlformats.org/markup-compatibility/2006" xmlns:aink="http://schemas.microsoft.com/office/drawing/2016/ink" xmlns:am3d="http://schemas.microsoft.com/office/drawing/2017/model3d" xmlns:o="urn:schemas-microsoft-com:office:office" xmlns:oel="http://schemas.microsoft.com/office/2019/extlst" xmlns:r="http://schemas.openxmlformats.org/officeDocument/2006/relationships" xmlns:m="http://schemas.openxmlformats.org/officeDocument/2006/math" xmlns:v="urn:schemas-microsoft-com:vml" xmlns:wp14="http://schemas.microsoft.com/office/word/2010/wordprocessingDrawing" xmlns:wp="http://schemas.openxmlformats.org/drawingml/2006/wordprocessingDrawing" xmlns:w10="urn:schemas-microsoft-com:office:word" xmlns:w="http://schemas.openxmlformats.org/wordprocessingml/2006/main" xmlns:w14="http://schemas.microsoft.com/office/word/2010/wordml" xmlns:w15="http://schemas.microsoft.com/office/word/2012/wordml" xmlns:w16cex="http://schemas.microsoft.com/office/word/2018/wordml/cex" xmlns:w16cid="http://schemas.microsoft.com/office/word/2016/wordml/cid" xmlns:w16="http://schemas.microsoft.com/office/word/2018/wordml" xmlns:w16du="http://schemas.microsoft.com/office/word/2023/wordml/word16du" xmlns:w16sdtdh="http://schemas.microsoft.com/office/word/2020/wordml/sdtdatahash" xmlns:w16sdtfl="http://schemas.microsoft.com/office/word/2024/wordml/sdtformatlock" xmlns:w16se="http://schemas.microsoft.com/office/word/2015/wordml/symex" xmlns:wpg="http://schemas.microsoft.com/office/word/2010/wordprocessingGroup" xmlns:wpi="http://schemas.microsoft.com/office/word/2010/wordprocessingInk" xmlns:wne="http://schemas.microsoft.com/office/word/2006/wordml" xmlns:wps="http://schemas.microsoft.com/office/word/2010/wordprocessingShape" mc:Ignorable="w14 w15 w16se w16cid w16 w16cex w16sdtdh w16sdtfl w16du wp14">
   <w:body>
     <w:p>
       <w:pPr>
@@ -75,7 +75,7 @@
           <w:szCs w:val="24"/>
           <w:lang w:val="en-US"/>
         </w:rPr>
-        <w:t>3.</w:t>
+        <w:t>4</w:t>
       </w:r>
       <w:r>
         <w:rPr>
@@ -85,7 +85,7 @@
           <w:szCs w:val="24"/>
           <w:lang w:val="en-US"/>
         </w:rPr>
-        <w:t>1</w:t>
+        <w:t>.</w:t>
       </w:r>
       <w:r>
         <w:rPr>
@@ -95,7 +95,7 @@
           <w:szCs w:val="24"/>
           <w:lang w:val="en-US"/>
         </w:rPr>
-        <w:t xml:space="preserve"> – </w:t>
+        <w:t>0</w:t>
       </w:r>
       <w:r>
         <w:rPr>
@@ -105,7 +105,7 @@
           <w:szCs w:val="24"/>
           <w:lang w:val="en-US"/>
         </w:rPr>
-        <w:t>2401</w:t>
+        <w:t xml:space="preserve"> – </w:t>
       </w:r>
       <w:r>
         <w:rPr>
@@ -115,7 +115,17 @@
           <w:szCs w:val="24"/>
           <w:lang w:val="en-US"/>
         </w:rPr>
-        <w:t>29</w:t>
+        <w:t>2</w:t>
+      </w:r>
+      <w:r>
+        <w:rPr>
+          <w:b/>
+          <w:bCs/>
+          <w:sz w:val="24"/>
+          <w:szCs w:val="24"/>
+          <w:lang w:val="en-US"/>
+        </w:rPr>
+        <w:t>60524</w:t>
       </w:r>
     </w:p>
     <w:p>
@@ -1312,8 +1322,6 @@
       <w:r>
         <w:br w:type="page"/>
       </w:r>
-      <w:bookmarkStart w:id="0" w:name="_GoBack"/>
-      <w:bookmarkEnd w:id="0"/>
     </w:p>
     <w:p>
       <w:pPr>
@@ -1322,7 +1330,7 @@
           <w:lang w:val="en-US"/>
         </w:rPr>
       </w:pPr>
-      <w:bookmarkStart w:id="1" w:name="_Toc133605171"/>
+      <w:bookmarkStart w:id="0" w:name="_Toc133605171"/>
       <w:r>
         <w:rPr>
           <w:lang w:val="en-US"/>
@@ -1330,7 +1338,7 @@
         <w:lastRenderedPageBreak/>
         <w:t>Introduction</w:t>
       </w:r>
-      <w:bookmarkEnd w:id="1"/>
+      <w:bookmarkEnd w:id="0"/>
     </w:p>
     <w:p>
       <w:pPr>
@@ -1573,7 +1581,19 @@
         <w:rPr>
           <w:lang w:val="en-US"/>
         </w:rPr>
-        <w:t>Windows 8 &amp; above (tested mostly on 10 &amp; 11 64Bit)</w:t>
+        <w:t xml:space="preserve">Windows </w:t>
+      </w:r>
+      <w:r>
+        <w:rPr>
+          <w:lang w:val="en-US"/>
+        </w:rPr>
+        <w:t>10</w:t>
+      </w:r>
+      <w:r>
+        <w:rPr>
+          <w:lang w:val="en-US"/>
+        </w:rPr>
+        <w:t xml:space="preserve"> &amp; above (tested mostly on 10 &amp; 11 64Bit)</w:t>
       </w:r>
     </w:p>
     <w:p>
@@ -1591,7 +1611,31 @@
         <w:rPr>
           <w:lang w:val="en-US"/>
         </w:rPr>
-        <w:t>NET8 Redistributable needed (will ask to install if not already done)</w:t>
+        <w:t>NET</w:t>
+      </w:r>
+      <w:r>
+        <w:rPr>
+          <w:lang w:val="en-US"/>
+        </w:rPr>
+        <w:t>10</w:t>
+      </w:r>
+      <w:r>
+        <w:rPr>
+          <w:lang w:val="en-US"/>
+        </w:rPr>
+        <w:t xml:space="preserve"> Redistributable </w:t>
+      </w:r>
+      <w:r>
+        <w:rPr>
+          <w:lang w:val="en-US"/>
+        </w:rPr>
+        <w:t xml:space="preserve">maybe </w:t>
+      </w:r>
+      <w:r>
+        <w:rPr>
+          <w:lang w:val="en-US"/>
+        </w:rPr>
+        <w:t>needed (will ask to install if not already done)</w:t>
       </w:r>
     </w:p>
     <w:p>
@@ -1635,7 +1679,19 @@
         <w:rPr>
           <w:lang w:val="en-US"/>
         </w:rPr>
-        <w:t>The program mainly</w:t>
+        <w:t xml:space="preserve">The program </w:t>
+      </w:r>
+      <w:r>
+        <w:rPr>
+          <w:lang w:val="en-US"/>
+        </w:rPr>
+        <w:t xml:space="preserve">is written in C# under NET10 &amp; </w:t>
+      </w:r>
+      <w:r>
+        <w:rPr>
+          <w:lang w:val="en-US"/>
+        </w:rPr>
+        <w:t>mainly</w:t>
       </w:r>
       <w:r>
         <w:rPr>
@@ -1724,7 +1780,7 @@
           <w:lang w:val="en-US"/>
         </w:rPr>
       </w:pPr>
-      <w:bookmarkStart w:id="2" w:name="_Toc133605172"/>
+      <w:bookmarkStart w:id="1" w:name="_Toc133605172"/>
       <w:r>
         <w:rPr>
           <w:lang w:val="en-US"/>
@@ -1732,6 +1788,29 @@
         <w:lastRenderedPageBreak/>
         <w:t>Overview</w:t>
       </w:r>
+      <w:bookmarkEnd w:id="1"/>
+    </w:p>
+    <w:p>
+      <w:pPr>
+        <w:rPr>
+          <w:lang w:val="en-US"/>
+        </w:rPr>
+      </w:pPr>
+    </w:p>
+    <w:p>
+      <w:pPr>
+        <w:pStyle w:val="berschrift2"/>
+        <w:rPr>
+          <w:lang w:val="en-US"/>
+        </w:rPr>
+      </w:pPr>
+      <w:bookmarkStart w:id="2" w:name="_Toc133605173"/>
+      <w:r>
+        <w:rPr>
+          <w:lang w:val="en-US"/>
+        </w:rPr>
+        <w:t>Main Program</w:t>
+      </w:r>
       <w:bookmarkEnd w:id="2"/>
     </w:p>
     <w:p>
@@ -1743,29 +1822,6 @@
     </w:p>
     <w:p>
       <w:pPr>
-        <w:pStyle w:val="berschrift2"/>
-        <w:rPr>
-          <w:lang w:val="en-US"/>
-        </w:rPr>
-      </w:pPr>
-      <w:bookmarkStart w:id="3" w:name="_Toc133605173"/>
-      <w:r>
-        <w:rPr>
-          <w:lang w:val="en-US"/>
-        </w:rPr>
-        <w:t>Main Program</w:t>
-      </w:r>
-      <w:bookmarkEnd w:id="3"/>
-    </w:p>
-    <w:p>
-      <w:pPr>
-        <w:rPr>
-          <w:lang w:val="en-US"/>
-        </w:rPr>
-      </w:pPr>
-    </w:p>
-    <w:p>
-      <w:pPr>
         <w:rPr>
           <w:noProof/>
           <w:lang w:val="en-US"/>
@@ -1777,7 +1833,7 @@
           <w:lang w:eastAsia="de-DE"/>
         </w:rPr>
         <w:drawing>
-          <wp:anchor distT="0" distB="0" distL="114300" distR="114300" simplePos="0" relativeHeight="251658240" behindDoc="0" locked="0" layoutInCell="1" allowOverlap="1" wp14:anchorId="09B06EAB" wp14:editId="4B620DCD">
+          <wp:anchor distT="0" distB="0" distL="114300" distR="114300" simplePos="0" relativeHeight="251658240" behindDoc="0" locked="0" layoutInCell="1" allowOverlap="1" wp14:anchorId="09B06EAB" wp14:editId="4C8502A1">
             <wp:simplePos x="0" y="0"/>
             <wp:positionH relativeFrom="margin">
               <wp:align>center</wp:align>
@@ -1935,7 +1991,7 @@
               </wp:anchor>
             </w:drawing>
           </mc:Choice>
-          <mc:Fallback xmlns:w16sdtdh="http://schemas.microsoft.com/office/word/2020/wordml/sdtdatahash" xmlns:w16="http://schemas.microsoft.com/office/word/2018/wordml" xmlns:w16cid="http://schemas.microsoft.com/office/word/2016/wordml/cid" xmlns:w16cex="http://schemas.microsoft.com/office/word/2018/wordml/cex" xmlns:oel="http://schemas.microsoft.com/office/2019/extlst" xmlns:am3d="http://schemas.microsoft.com/office/drawing/2017/model3d" xmlns:aink="http://schemas.microsoft.com/office/drawing/2016/ink" xmlns:cx8="http://schemas.microsoft.com/office/drawing/2016/5/14/chartex" xmlns:cx7="http://schemas.microsoft.com/office/drawing/2016/5/13/chartex" xmlns:cx6="http://schemas.microsoft.com/office/drawing/2016/5/12/chartex" xmlns:cx5="http://schemas.microsoft.com/office/drawing/2016/5/11/chartex" xmlns:cx4="http://schemas.microsoft.com/office/drawing/2016/5/10/chartex" xmlns:cx3="http://schemas.microsoft.com/office/drawing/2016/5/9/chartex" xmlns:cx2="http://schemas.microsoft.com/office/drawing/2015/10/21/chartex">
+          <mc:Fallback>
             <w:pict>
               <v:roundrect w14:anchorId="089548D4" id="Rechteck: abgerundete Ecken 3" o:spid="_x0000_s1026" style="position:absolute;margin-left:418.65pt;margin-top:27.6pt;width:27pt;height:27pt;z-index:251667456;visibility:visible;mso-wrap-style:square;mso-width-percent:0;mso-height-percent:0;mso-wrap-distance-left:9pt;mso-wrap-distance-top:0;mso-wrap-distance-right:9pt;mso-wrap-distance-bottom:0;mso-position-horizontal:absolute;mso-position-horizontal-relative:text;mso-position-vertical:absolute;mso-position-vertical-relative:text;mso-width-percent:0;mso-height-percent:0;mso-width-relative:margin;mso-height-relative:margin;v-text-anchor:middle" arcsize="10923f" o:gfxdata="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" fillcolor="white [3212]" strokecolor="black [3200]" strokeweight="1pt">
                 <v:stroke joinstyle="miter"/>
@@ -2062,7 +2118,7 @@
               </wp:anchor>
             </w:drawing>
           </mc:Choice>
-          <mc:Fallback xmlns:w16sdtdh="http://schemas.microsoft.com/office/word/2020/wordml/sdtdatahash" xmlns:w16="http://schemas.microsoft.com/office/word/2018/wordml" xmlns:w16cid="http://schemas.microsoft.com/office/word/2016/wordml/cid" xmlns:w16cex="http://schemas.microsoft.com/office/word/2018/wordml/cex" xmlns:oel="http://schemas.microsoft.com/office/2019/extlst" xmlns:am3d="http://schemas.microsoft.com/office/drawing/2017/model3d" xmlns:aink="http://schemas.microsoft.com/office/drawing/2016/ink" xmlns:cx8="http://schemas.microsoft.com/office/drawing/2016/5/14/chartex" xmlns:cx7="http://schemas.microsoft.com/office/drawing/2016/5/13/chartex" xmlns:cx6="http://schemas.microsoft.com/office/drawing/2016/5/12/chartex" xmlns:cx5="http://schemas.microsoft.com/office/drawing/2016/5/11/chartex" xmlns:cx4="http://schemas.microsoft.com/office/drawing/2016/5/10/chartex" xmlns:cx3="http://schemas.microsoft.com/office/drawing/2016/5/9/chartex" xmlns:cx2="http://schemas.microsoft.com/office/drawing/2015/10/21/chartex">
+          <mc:Fallback>
             <w:pict>
               <v:roundrect w14:anchorId="5C0809DF" id="_x0000_s1027" style="position:absolute;margin-left:86.65pt;margin-top:27.6pt;width:27pt;height:27pt;z-index:251661312;visibility:visible;mso-wrap-style:square;mso-width-percent:0;mso-height-percent:0;mso-wrap-distance-left:9pt;mso-wrap-distance-top:0;mso-wrap-distance-right:9pt;mso-wrap-distance-bottom:0;mso-position-horizontal:absolute;mso-position-horizontal-relative:text;mso-position-vertical:absolute;mso-position-vertical-relative:text;mso-width-percent:0;mso-height-percent:0;mso-width-relative:margin;mso-height-relative:margin;v-text-anchor:middle" arcsize="10923f" o:gfxdata="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" fillcolor="white [3212]" strokecolor="black [3200]" strokeweight="1pt">
                 <v:stroke joinstyle="miter"/>
@@ -2200,7 +2256,7 @@
               </wp:anchor>
             </w:drawing>
           </mc:Choice>
-          <mc:Fallback xmlns:w16sdtdh="http://schemas.microsoft.com/office/word/2020/wordml/sdtdatahash" xmlns:w16="http://schemas.microsoft.com/office/word/2018/wordml" xmlns:w16cid="http://schemas.microsoft.com/office/word/2016/wordml/cid" xmlns:w16cex="http://schemas.microsoft.com/office/word/2018/wordml/cex" xmlns:oel="http://schemas.microsoft.com/office/2019/extlst" xmlns:am3d="http://schemas.microsoft.com/office/drawing/2017/model3d" xmlns:aink="http://schemas.microsoft.com/office/drawing/2016/ink" xmlns:cx8="http://schemas.microsoft.com/office/drawing/2016/5/14/chartex" xmlns:cx7="http://schemas.microsoft.com/office/drawing/2016/5/13/chartex" xmlns:cx6="http://schemas.microsoft.com/office/drawing/2016/5/12/chartex" xmlns:cx5="http://schemas.microsoft.com/office/drawing/2016/5/11/chartex" xmlns:cx4="http://schemas.microsoft.com/office/drawing/2016/5/10/chartex" xmlns:cx3="http://schemas.microsoft.com/office/drawing/2016/5/9/chartex" xmlns:cx2="http://schemas.microsoft.com/office/drawing/2015/10/21/chartex">
+          <mc:Fallback>
             <w:pict>
               <v:roundrect w14:anchorId="47C3DBAC" id="_x0000_s1028" style="position:absolute;margin-left:140pt;margin-top:27.45pt;width:27pt;height:27pt;z-index:251663360;visibility:visible;mso-wrap-style:square;mso-width-percent:0;mso-height-percent:0;mso-wrap-distance-left:9pt;mso-wrap-distance-top:0;mso-wrap-distance-right:9pt;mso-wrap-distance-bottom:0;mso-position-horizontal:absolute;mso-position-horizontal-relative:text;mso-position-vertical:absolute;mso-position-vertical-relative:text;mso-width-percent:0;mso-height-percent:0;mso-width-relative:margin;mso-height-relative:margin;v-text-anchor:middle" arcsize="10923f" o:gfxdata="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" fillcolor="white [3212]" strokecolor="black [3200]" strokeweight="1pt">
                 <v:stroke joinstyle="miter"/>
@@ -2338,7 +2394,7 @@
               </wp:anchor>
             </w:drawing>
           </mc:Choice>
-          <mc:Fallback xmlns:w16sdtdh="http://schemas.microsoft.com/office/word/2020/wordml/sdtdatahash" xmlns:w16="http://schemas.microsoft.com/office/word/2018/wordml" xmlns:w16cid="http://schemas.microsoft.com/office/word/2016/wordml/cid" xmlns:w16cex="http://schemas.microsoft.com/office/word/2018/wordml/cex" xmlns:oel="http://schemas.microsoft.com/office/2019/extlst" xmlns:am3d="http://schemas.microsoft.com/office/drawing/2017/model3d" xmlns:aink="http://schemas.microsoft.com/office/drawing/2016/ink" xmlns:cx8="http://schemas.microsoft.com/office/drawing/2016/5/14/chartex" xmlns:cx7="http://schemas.microsoft.com/office/drawing/2016/5/13/chartex" xmlns:cx6="http://schemas.microsoft.com/office/drawing/2016/5/12/chartex" xmlns:cx5="http://schemas.microsoft.com/office/drawing/2016/5/11/chartex" xmlns:cx4="http://schemas.microsoft.com/office/drawing/2016/5/10/chartex" xmlns:cx3="http://schemas.microsoft.com/office/drawing/2016/5/9/chartex" xmlns:cx2="http://schemas.microsoft.com/office/drawing/2015/10/21/chartex">
+          <mc:Fallback>
             <w:pict>
               <v:roundrect w14:anchorId="58EB7373" id="_x0000_s1029" style="position:absolute;margin-left:350.15pt;margin-top:278.6pt;width:27pt;height:27pt;z-index:251675648;visibility:visible;mso-wrap-style:square;mso-width-percent:0;mso-height-percent:0;mso-wrap-distance-left:9pt;mso-wrap-distance-top:0;mso-wrap-distance-right:9pt;mso-wrap-distance-bottom:0;mso-position-horizontal:absolute;mso-position-horizontal-relative:text;mso-position-vertical:absolute;mso-position-vertical-relative:text;mso-width-percent:0;mso-height-percent:0;mso-width-relative:margin;mso-height-relative:margin;v-text-anchor:middle" arcsize="10923f" o:gfxdata="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" fillcolor="white [3212]" strokecolor="black [3200]" strokeweight="1pt">
                 <v:stroke joinstyle="miter"/>
@@ -2465,7 +2521,7 @@
               </wp:anchor>
             </w:drawing>
           </mc:Choice>
-          <mc:Fallback xmlns:w16sdtdh="http://schemas.microsoft.com/office/word/2020/wordml/sdtdatahash" xmlns:w16="http://schemas.microsoft.com/office/word/2018/wordml" xmlns:w16cid="http://schemas.microsoft.com/office/word/2016/wordml/cid" xmlns:w16cex="http://schemas.microsoft.com/office/word/2018/wordml/cex" xmlns:oel="http://schemas.microsoft.com/office/2019/extlst" xmlns:am3d="http://schemas.microsoft.com/office/drawing/2017/model3d" xmlns:aink="http://schemas.microsoft.com/office/drawing/2016/ink" xmlns:cx8="http://schemas.microsoft.com/office/drawing/2016/5/14/chartex" xmlns:cx7="http://schemas.microsoft.com/office/drawing/2016/5/13/chartex" xmlns:cx6="http://schemas.microsoft.com/office/drawing/2016/5/12/chartex" xmlns:cx5="http://schemas.microsoft.com/office/drawing/2016/5/11/chartex" xmlns:cx4="http://schemas.microsoft.com/office/drawing/2016/5/10/chartex" xmlns:cx3="http://schemas.microsoft.com/office/drawing/2016/5/9/chartex" xmlns:cx2="http://schemas.microsoft.com/office/drawing/2015/10/21/chartex">
+          <mc:Fallback>
             <w:pict>
               <v:roundrect w14:anchorId="3F554758" id="_x0000_s1030" style="position:absolute;margin-left:441.65pt;margin-top:163.6pt;width:27pt;height:27pt;z-index:251673600;visibility:visible;mso-wrap-style:square;mso-width-percent:0;mso-height-percent:0;mso-wrap-distance-left:9pt;mso-wrap-distance-top:0;mso-wrap-distance-right:9pt;mso-wrap-distance-bottom:0;mso-position-horizontal:absolute;mso-position-horizontal-relative:text;mso-position-vertical:absolute;mso-position-vertical-relative:text;mso-width-percent:0;mso-height-percent:0;mso-width-relative:margin;mso-height-relative:margin;v-text-anchor:middle" arcsize="10923f" o:gfxdata="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" fillcolor="white [3212]" strokecolor="black [3200]" strokeweight="1pt">
                 <v:stroke joinstyle="miter"/>
@@ -2592,7 +2648,7 @@
               </wp:anchor>
             </w:drawing>
           </mc:Choice>
-          <mc:Fallback xmlns:w16sdtdh="http://schemas.microsoft.com/office/word/2020/wordml/sdtdatahash" xmlns:w16="http://schemas.microsoft.com/office/word/2018/wordml" xmlns:w16cid="http://schemas.microsoft.com/office/word/2016/wordml/cid" xmlns:w16cex="http://schemas.microsoft.com/office/word/2018/wordml/cex" xmlns:oel="http://schemas.microsoft.com/office/2019/extlst" xmlns:am3d="http://schemas.microsoft.com/office/drawing/2017/model3d" xmlns:aink="http://schemas.microsoft.com/office/drawing/2016/ink" xmlns:cx8="http://schemas.microsoft.com/office/drawing/2016/5/14/chartex" xmlns:cx7="http://schemas.microsoft.com/office/drawing/2016/5/13/chartex" xmlns:cx6="http://schemas.microsoft.com/office/drawing/2016/5/12/chartex" xmlns:cx5="http://schemas.microsoft.com/office/drawing/2016/5/11/chartex" xmlns:cx4="http://schemas.microsoft.com/office/drawing/2016/5/10/chartex" xmlns:cx3="http://schemas.microsoft.com/office/drawing/2016/5/9/chartex" xmlns:cx2="http://schemas.microsoft.com/office/drawing/2015/10/21/chartex">
+          <mc:Fallback>
             <w:pict>
               <v:roundrect w14:anchorId="6987BD0A" id="_x0000_s1031" style="position:absolute;margin-left:441.65pt;margin-top:77.1pt;width:27pt;height:27pt;z-index:251671552;visibility:visible;mso-wrap-style:square;mso-width-percent:0;mso-height-percent:0;mso-wrap-distance-left:9pt;mso-wrap-distance-top:0;mso-wrap-distance-right:9pt;mso-wrap-distance-bottom:0;mso-position-horizontal:absolute;mso-position-horizontal-relative:text;mso-position-vertical:absolute;mso-position-vertical-relative:text;mso-width-percent:0;mso-height-percent:0;mso-width-relative:margin;mso-height-relative:margin;v-text-anchor:middle" arcsize="10923f" o:gfxdata="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" fillcolor="white [3212]" strokecolor="black [3200]" strokeweight="1pt">
                 <v:stroke joinstyle="miter"/>
@@ -2719,7 +2775,7 @@
               </wp:anchor>
             </w:drawing>
           </mc:Choice>
-          <mc:Fallback xmlns:w16sdtdh="http://schemas.microsoft.com/office/word/2020/wordml/sdtdatahash" xmlns:w16="http://schemas.microsoft.com/office/word/2018/wordml" xmlns:w16cid="http://schemas.microsoft.com/office/word/2016/wordml/cid" xmlns:w16cex="http://schemas.microsoft.com/office/word/2018/wordml/cex" xmlns:oel="http://schemas.microsoft.com/office/2019/extlst" xmlns:am3d="http://schemas.microsoft.com/office/drawing/2017/model3d" xmlns:aink="http://schemas.microsoft.com/office/drawing/2016/ink" xmlns:cx8="http://schemas.microsoft.com/office/drawing/2016/5/14/chartex" xmlns:cx7="http://schemas.microsoft.com/office/drawing/2016/5/13/chartex" xmlns:cx6="http://schemas.microsoft.com/office/drawing/2016/5/12/chartex" xmlns:cx5="http://schemas.microsoft.com/office/drawing/2016/5/11/chartex" xmlns:cx4="http://schemas.microsoft.com/office/drawing/2016/5/10/chartex" xmlns:cx3="http://schemas.microsoft.com/office/drawing/2016/5/9/chartex" xmlns:cx2="http://schemas.microsoft.com/office/drawing/2015/10/21/chartex">
+          <mc:Fallback>
             <w:pict>
               <v:roundrect w14:anchorId="5258EE3E" id="_x0000_s1032" style="position:absolute;margin-left:120.15pt;margin-top:180.6pt;width:27pt;height:27pt;z-index:251669504;visibility:visible;mso-wrap-style:square;mso-width-percent:0;mso-height-percent:0;mso-wrap-distance-left:9pt;mso-wrap-distance-top:0;mso-wrap-distance-right:9pt;mso-wrap-distance-bottom:0;mso-position-horizontal:absolute;mso-position-horizontal-relative:text;mso-position-vertical:absolute;mso-position-vertical-relative:text;mso-width-percent:0;mso-height-percent:0;mso-width-relative:margin;mso-height-relative:margin;v-text-anchor:middle" arcsize="10923f" o:gfxdata="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" fillcolor="white [3212]" strokecolor="black [3200]" strokeweight="1pt">
                 <v:stroke joinstyle="miter"/>
@@ -2846,7 +2902,7 @@
               </wp:anchor>
             </w:drawing>
           </mc:Choice>
-          <mc:Fallback xmlns:w16sdtdh="http://schemas.microsoft.com/office/word/2020/wordml/sdtdatahash" xmlns:w16="http://schemas.microsoft.com/office/word/2018/wordml" xmlns:w16cid="http://schemas.microsoft.com/office/word/2016/wordml/cid" xmlns:w16cex="http://schemas.microsoft.com/office/word/2018/wordml/cex" xmlns:oel="http://schemas.microsoft.com/office/2019/extlst" xmlns:am3d="http://schemas.microsoft.com/office/drawing/2017/model3d" xmlns:aink="http://schemas.microsoft.com/office/drawing/2016/ink" xmlns:cx8="http://schemas.microsoft.com/office/drawing/2016/5/14/chartex" xmlns:cx7="http://schemas.microsoft.com/office/drawing/2016/5/13/chartex" xmlns:cx6="http://schemas.microsoft.com/office/drawing/2016/5/12/chartex" xmlns:cx5="http://schemas.microsoft.com/office/drawing/2016/5/11/chartex" xmlns:cx4="http://schemas.microsoft.com/office/drawing/2016/5/10/chartex" xmlns:cx3="http://schemas.microsoft.com/office/drawing/2016/5/9/chartex" xmlns:cx2="http://schemas.microsoft.com/office/drawing/2015/10/21/chartex">
+          <mc:Fallback>
             <w:pict>
               <v:roundrect w14:anchorId="5D6F606A" id="_x0000_s1033" style="position:absolute;margin-left:239.15pt;margin-top:27.6pt;width:27pt;height:27pt;z-index:251665408;visibility:visible;mso-wrap-style:square;mso-width-percent:0;mso-height-percent:0;mso-wrap-distance-left:9pt;mso-wrap-distance-top:0;mso-wrap-distance-right:9pt;mso-wrap-distance-bottom:0;mso-position-horizontal:absolute;mso-position-horizontal-relative:text;mso-position-vertical:absolute;mso-position-vertical-relative:text;mso-width-percent:0;mso-height-percent:0;mso-width-relative:margin;mso-height-relative:margin;v-text-anchor:middle" arcsize="10923f" o:gfxdata="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" fillcolor="white [3212]" strokecolor="black [3200]" strokeweight="1pt">
                 <v:stroke joinstyle="miter"/>
@@ -2973,7 +3029,7 @@
               </wp:anchor>
             </w:drawing>
           </mc:Choice>
-          <mc:Fallback xmlns:w16sdtdh="http://schemas.microsoft.com/office/word/2020/wordml/sdtdatahash" xmlns:w16="http://schemas.microsoft.com/office/word/2018/wordml" xmlns:w16cid="http://schemas.microsoft.com/office/word/2016/wordml/cid" xmlns:w16cex="http://schemas.microsoft.com/office/word/2018/wordml/cex" xmlns:oel="http://schemas.microsoft.com/office/2019/extlst" xmlns:am3d="http://schemas.microsoft.com/office/drawing/2017/model3d" xmlns:aink="http://schemas.microsoft.com/office/drawing/2016/ink" xmlns:cx8="http://schemas.microsoft.com/office/drawing/2016/5/14/chartex" xmlns:cx7="http://schemas.microsoft.com/office/drawing/2016/5/13/chartex" xmlns:cx6="http://schemas.microsoft.com/office/drawing/2016/5/12/chartex" xmlns:cx5="http://schemas.microsoft.com/office/drawing/2016/5/11/chartex" xmlns:cx4="http://schemas.microsoft.com/office/drawing/2016/5/10/chartex" xmlns:cx3="http://schemas.microsoft.com/office/drawing/2016/5/9/chartex" xmlns:cx2="http://schemas.microsoft.com/office/drawing/2015/10/21/chartex">
+          <mc:Fallback>
             <w:pict>
               <v:roundrect w14:anchorId="2814F502" id="_x0000_s1034" style="position:absolute;margin-left:-16.35pt;margin-top:15.1pt;width:27pt;height:27pt;z-index:251659264;visibility:visible;mso-wrap-style:square;mso-width-percent:0;mso-height-percent:0;mso-wrap-distance-left:9pt;mso-wrap-distance-top:0;mso-wrap-distance-right:9pt;mso-wrap-distance-bottom:0;mso-position-horizontal:absolute;mso-position-horizontal-relative:text;mso-position-vertical:absolute;mso-position-vertical-relative:text;mso-width-percent:0;mso-height-percent:0;mso-width-relative:margin;mso-height-relative:margin;v-text-anchor:middle" arcsize="10923f" o:gfxdata="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" fillcolor="white [3212]" strokecolor="black [3200]" strokeweight="1pt">
                 <v:stroke joinstyle="miter"/>
@@ -3202,7 +3258,7 @@
         </w:rPr>
         <w:br w:type="page"/>
       </w:r>
-      <w:bookmarkStart w:id="4" w:name="_Toc133605174"/>
+      <w:bookmarkStart w:id="3" w:name="_Toc133605174"/>
       <w:r>
         <w:rPr>
           <w:lang w:val="en-US"/>
@@ -3210,30 +3266,30 @@
         <w:lastRenderedPageBreak/>
         <w:t>Parameters</w:t>
       </w:r>
+      <w:bookmarkEnd w:id="3"/>
+    </w:p>
+    <w:p>
+      <w:pPr>
+        <w:rPr>
+          <w:lang w:val="en-US"/>
+        </w:rPr>
+      </w:pPr>
+    </w:p>
+    <w:p>
+      <w:pPr>
+        <w:pStyle w:val="berschrift3"/>
+        <w:rPr>
+          <w:lang w:val="en-US"/>
+        </w:rPr>
+      </w:pPr>
+      <w:bookmarkStart w:id="4" w:name="_Toc133605175"/>
+      <w:r>
+        <w:rPr>
+          <w:lang w:val="en-US"/>
+        </w:rPr>
+        <w:t>Playback</w:t>
+      </w:r>
       <w:bookmarkEnd w:id="4"/>
-    </w:p>
-    <w:p>
-      <w:pPr>
-        <w:rPr>
-          <w:lang w:val="en-US"/>
-        </w:rPr>
-      </w:pPr>
-    </w:p>
-    <w:p>
-      <w:pPr>
-        <w:pStyle w:val="berschrift3"/>
-        <w:rPr>
-          <w:lang w:val="en-US"/>
-        </w:rPr>
-      </w:pPr>
-      <w:bookmarkStart w:id="5" w:name="_Toc133605175"/>
-      <w:r>
-        <w:rPr>
-          <w:lang w:val="en-US"/>
-        </w:rPr>
-        <w:t>Playback</w:t>
-      </w:r>
-      <w:bookmarkEnd w:id="5"/>
     </w:p>
     <w:p>
       <w:pPr>
@@ -3987,14 +4043,14 @@
           <w:lang w:val="en-US"/>
         </w:rPr>
       </w:pPr>
-      <w:bookmarkStart w:id="6" w:name="_Toc133605176"/>
+      <w:bookmarkStart w:id="5" w:name="_Toc133605176"/>
       <w:r>
         <w:rPr>
           <w:lang w:val="en-US"/>
         </w:rPr>
         <w:t>Organize</w:t>
       </w:r>
-      <w:bookmarkEnd w:id="6"/>
+      <w:bookmarkEnd w:id="5"/>
     </w:p>
     <w:p>
       <w:pPr>
@@ -4264,7 +4320,7 @@
           <w:lang w:val="en-US"/>
         </w:rPr>
       </w:pPr>
-      <w:bookmarkStart w:id="7" w:name="_Toc133605177"/>
+      <w:bookmarkStart w:id="6" w:name="_Toc133605177"/>
       <w:r>
         <w:rPr>
           <w:lang w:val="en-US"/>
@@ -4272,7 +4328,7 @@
         <w:lastRenderedPageBreak/>
         <w:t>Room Creation</w:t>
       </w:r>
-      <w:bookmarkEnd w:id="7"/>
+      <w:bookmarkEnd w:id="6"/>
     </w:p>
     <w:p>
       <w:pPr>
@@ -5146,7 +5202,7 @@
           <w:lang w:val="en-US"/>
         </w:rPr>
       </w:pPr>
-      <w:bookmarkStart w:id="8" w:name="_Toc133605178"/>
+      <w:bookmarkStart w:id="7" w:name="_Toc133605178"/>
       <w:r>
         <w:rPr>
           <w:noProof/>
@@ -5155,7 +5211,7 @@
         <w:lastRenderedPageBreak/>
         <w:t>Effects</w:t>
       </w:r>
-      <w:bookmarkEnd w:id="8"/>
+      <w:bookmarkEnd w:id="7"/>
     </w:p>
     <w:p>
       <w:pPr>
@@ -5501,7 +5557,7 @@
           <w:lang w:val="en-US"/>
         </w:rPr>
       </w:pPr>
-      <w:bookmarkStart w:id="9" w:name="_Toc133605179"/>
+      <w:bookmarkStart w:id="8" w:name="_Toc133605179"/>
       <w:r>
         <w:rPr>
           <w:lang w:val="en-US"/>
@@ -5509,7 +5565,7 @@
         <w:lastRenderedPageBreak/>
         <w:t>Destructive Effects Editor</w:t>
       </w:r>
-      <w:bookmarkEnd w:id="9"/>
+      <w:bookmarkEnd w:id="8"/>
     </w:p>
     <w:p>
       <w:pPr>
@@ -5612,7 +5668,7 @@
               </wp:anchor>
             </w:drawing>
           </mc:Choice>
-          <mc:Fallback xmlns:w16sdtdh="http://schemas.microsoft.com/office/word/2020/wordml/sdtdatahash" xmlns:w16="http://schemas.microsoft.com/office/word/2018/wordml" xmlns:w16cid="http://schemas.microsoft.com/office/word/2016/wordml/cid" xmlns:w16cex="http://schemas.microsoft.com/office/word/2018/wordml/cex" xmlns:oel="http://schemas.microsoft.com/office/2019/extlst" xmlns:am3d="http://schemas.microsoft.com/office/drawing/2017/model3d" xmlns:aink="http://schemas.microsoft.com/office/drawing/2016/ink" xmlns:cx8="http://schemas.microsoft.com/office/drawing/2016/5/14/chartex" xmlns:cx7="http://schemas.microsoft.com/office/drawing/2016/5/13/chartex" xmlns:cx6="http://schemas.microsoft.com/office/drawing/2016/5/12/chartex" xmlns:cx5="http://schemas.microsoft.com/office/drawing/2016/5/11/chartex" xmlns:cx4="http://schemas.microsoft.com/office/drawing/2016/5/10/chartex" xmlns:cx3="http://schemas.microsoft.com/office/drawing/2016/5/9/chartex" xmlns:cx2="http://schemas.microsoft.com/office/drawing/2015/10/21/chartex">
+          <mc:Fallback>
             <w:pict>
               <v:roundrect w14:anchorId="43B4C91D" id="_x0000_s1035" style="position:absolute;margin-left:452.2pt;margin-top:115.15pt;width:27pt;height:27pt;z-index:251679744;visibility:visible;mso-wrap-style:square;mso-width-percent:0;mso-height-percent:0;mso-wrap-distance-left:9pt;mso-wrap-distance-top:0;mso-wrap-distance-right:9pt;mso-wrap-distance-bottom:0;mso-position-horizontal:absolute;mso-position-horizontal-relative:text;mso-position-vertical:absolute;mso-position-vertical-relative:text;mso-width-percent:0;mso-height-percent:0;mso-width-relative:margin;mso-height-relative:margin;v-text-anchor:middle" arcsize="10923f" o:gfxdata="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" fillcolor="white [3212]" strokecolor="black [3200]" strokeweight="1pt">
                 <v:stroke joinstyle="miter"/>
@@ -5651,7 +5707,7 @@
           <w:lang w:eastAsia="de-DE"/>
         </w:rPr>
         <w:drawing>
-          <wp:anchor distT="0" distB="0" distL="114300" distR="114300" simplePos="0" relativeHeight="251677696" behindDoc="0" locked="0" layoutInCell="1" allowOverlap="1" wp14:anchorId="472F444B" wp14:editId="25B4ED66">
+          <wp:anchor distT="0" distB="0" distL="114300" distR="114300" simplePos="0" relativeHeight="251677696" behindDoc="0" locked="0" layoutInCell="1" allowOverlap="1" wp14:anchorId="472F444B" wp14:editId="5CBCA7FA">
             <wp:simplePos x="0" y="0"/>
             <wp:positionH relativeFrom="margin">
               <wp:posOffset>1905</wp:posOffset>
@@ -5809,7 +5865,7 @@
               </wp:anchor>
             </w:drawing>
           </mc:Choice>
-          <mc:Fallback xmlns:w16sdtdh="http://schemas.microsoft.com/office/word/2020/wordml/sdtdatahash" xmlns:w16="http://schemas.microsoft.com/office/word/2018/wordml" xmlns:w16cid="http://schemas.microsoft.com/office/word/2016/wordml/cid" xmlns:w16cex="http://schemas.microsoft.com/office/word/2018/wordml/cex" xmlns:oel="http://schemas.microsoft.com/office/2019/extlst" xmlns:am3d="http://schemas.microsoft.com/office/drawing/2017/model3d" xmlns:aink="http://schemas.microsoft.com/office/drawing/2016/ink" xmlns:cx8="http://schemas.microsoft.com/office/drawing/2016/5/14/chartex" xmlns:cx7="http://schemas.microsoft.com/office/drawing/2016/5/13/chartex" xmlns:cx6="http://schemas.microsoft.com/office/drawing/2016/5/12/chartex" xmlns:cx5="http://schemas.microsoft.com/office/drawing/2016/5/11/chartex" xmlns:cx4="http://schemas.microsoft.com/office/drawing/2016/5/10/chartex" xmlns:cx3="http://schemas.microsoft.com/office/drawing/2016/5/9/chartex" xmlns:cx2="http://schemas.microsoft.com/office/drawing/2015/10/21/chartex">
+          <mc:Fallback>
             <w:pict>
               <v:roundrect w14:anchorId="28F9E3E8" id="_x0000_s1036" style="position:absolute;margin-left:406pt;margin-top:240.05pt;width:27pt;height:27pt;z-index:251681792;visibility:visible;mso-wrap-style:square;mso-width-percent:0;mso-height-percent:0;mso-wrap-distance-left:9pt;mso-wrap-distance-top:0;mso-wrap-distance-right:9pt;mso-wrap-distance-bottom:0;mso-position-horizontal:absolute;mso-position-horizontal-relative:text;mso-position-vertical:absolute;mso-position-vertical-relative:text;mso-width-percent:0;mso-height-percent:0;mso-width-relative:margin;mso-height-relative:margin;v-text-anchor:middle" arcsize="10923f" o:gfxdata="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" fillcolor="white [3212]" strokecolor="black [3200]" strokeweight="1pt">
                 <v:stroke joinstyle="miter"/>
@@ -5947,7 +6003,7 @@
               </wp:anchor>
             </w:drawing>
           </mc:Choice>
-          <mc:Fallback xmlns:w16sdtdh="http://schemas.microsoft.com/office/word/2020/wordml/sdtdatahash" xmlns:w16="http://schemas.microsoft.com/office/word/2018/wordml" xmlns:w16cid="http://schemas.microsoft.com/office/word/2016/wordml/cid" xmlns:w16cex="http://schemas.microsoft.com/office/word/2018/wordml/cex" xmlns:oel="http://schemas.microsoft.com/office/2019/extlst" xmlns:am3d="http://schemas.microsoft.com/office/drawing/2017/model3d" xmlns:aink="http://schemas.microsoft.com/office/drawing/2016/ink" xmlns:cx8="http://schemas.microsoft.com/office/drawing/2016/5/14/chartex" xmlns:cx7="http://schemas.microsoft.com/office/drawing/2016/5/13/chartex" xmlns:cx6="http://schemas.microsoft.com/office/drawing/2016/5/12/chartex" xmlns:cx5="http://schemas.microsoft.com/office/drawing/2016/5/11/chartex" xmlns:cx4="http://schemas.microsoft.com/office/drawing/2016/5/10/chartex" xmlns:cx3="http://schemas.microsoft.com/office/drawing/2016/5/9/chartex" xmlns:cx2="http://schemas.microsoft.com/office/drawing/2015/10/21/chartex">
+          <mc:Fallback>
             <w:pict>
               <v:roundrect w14:anchorId="156AF791" id="_x0000_s1037" style="position:absolute;margin-left:180.85pt;margin-top:239.9pt;width:27pt;height:27pt;z-index:251680768;visibility:visible;mso-wrap-style:square;mso-width-percent:0;mso-height-percent:0;mso-wrap-distance-left:9pt;mso-wrap-distance-top:0;mso-wrap-distance-right:9pt;mso-wrap-distance-bottom:0;mso-position-horizontal:absolute;mso-position-horizontal-relative:text;mso-position-vertical:absolute;mso-position-vertical-relative:text;mso-width-percent:0;mso-height-percent:0;mso-width-relative:margin;mso-height-relative:margin;v-text-anchor:middle" arcsize="10923f" o:gfxdata="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" fillcolor="white [3212]" strokecolor="black [3200]" strokeweight="1pt">
                 <v:stroke joinstyle="miter"/>
@@ -6085,7 +6141,7 @@
               </wp:anchor>
             </w:drawing>
           </mc:Choice>
-          <mc:Fallback xmlns:w16sdtdh="http://schemas.microsoft.com/office/word/2020/wordml/sdtdatahash" xmlns:w16="http://schemas.microsoft.com/office/word/2018/wordml" xmlns:w16cid="http://schemas.microsoft.com/office/word/2016/wordml/cid" xmlns:w16cex="http://schemas.microsoft.com/office/word/2018/wordml/cex" xmlns:oel="http://schemas.microsoft.com/office/2019/extlst" xmlns:am3d="http://schemas.microsoft.com/office/drawing/2017/model3d" xmlns:aink="http://schemas.microsoft.com/office/drawing/2016/ink" xmlns:cx8="http://schemas.microsoft.com/office/drawing/2016/5/14/chartex" xmlns:cx7="http://schemas.microsoft.com/office/drawing/2016/5/13/chartex" xmlns:cx6="http://schemas.microsoft.com/office/drawing/2016/5/12/chartex" xmlns:cx5="http://schemas.microsoft.com/office/drawing/2016/5/11/chartex" xmlns:cx4="http://schemas.microsoft.com/office/drawing/2016/5/10/chartex" xmlns:cx3="http://schemas.microsoft.com/office/drawing/2016/5/9/chartex" xmlns:cx2="http://schemas.microsoft.com/office/drawing/2015/10/21/chartex">
+          <mc:Fallback>
             <w:pict>
               <v:roundrect w14:anchorId="0BE118CA" id="_x0000_s1038" style="position:absolute;margin-left:180.5pt;margin-top:115.15pt;width:27pt;height:27pt;z-index:251678720;visibility:visible;mso-wrap-style:square;mso-width-percent:0;mso-height-percent:0;mso-wrap-distance-left:9pt;mso-wrap-distance-top:0;mso-wrap-distance-right:9pt;mso-wrap-distance-bottom:0;mso-position-horizontal:absolute;mso-position-horizontal-relative:text;mso-position-vertical:absolute;mso-position-vertical-relative:text;mso-width-percent:0;mso-height-percent:0;mso-width-relative:margin;mso-height-relative:margin;v-text-anchor:middle" arcsize="10923f" o:gfxdata="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" fillcolor="white [3212]" strokecolor="black [3200]" strokeweight="1pt">
                 <v:stroke joinstyle="miter"/>
@@ -6316,14 +6372,14 @@
           <w:lang w:val="en-US"/>
         </w:rPr>
       </w:pPr>
-      <w:bookmarkStart w:id="10" w:name="_Toc133605180"/>
+      <w:bookmarkStart w:id="9" w:name="_Toc133605180"/>
       <w:r>
         <w:rPr>
           <w:lang w:val="en-US"/>
         </w:rPr>
         <w:t>Tools</w:t>
       </w:r>
-      <w:bookmarkEnd w:id="10"/>
+      <w:bookmarkEnd w:id="9"/>
     </w:p>
     <w:p>
       <w:pPr>
@@ -6622,7 +6678,7 @@
           <w:lang w:val="en-US"/>
         </w:rPr>
       </w:pPr>
-      <w:bookmarkStart w:id="11" w:name="_Toc133605181"/>
+      <w:bookmarkStart w:id="10" w:name="_Toc133605181"/>
       <w:r>
         <w:rPr>
           <w:noProof/>
@@ -6637,7 +6693,7 @@
         </w:rPr>
         <w:t xml:space="preserve"> Tools</w:t>
       </w:r>
-      <w:bookmarkEnd w:id="11"/>
+      <w:bookmarkEnd w:id="10"/>
     </w:p>
     <w:p>
       <w:pPr>
@@ -6699,7 +6755,7 @@
           <w:lang w:val="en-US"/>
         </w:rPr>
       </w:pPr>
-      <w:bookmarkStart w:id="12" w:name="_Toc133605182"/>
+      <w:bookmarkStart w:id="11" w:name="_Toc133605182"/>
       <w:r>
         <w:rPr>
           <w:lang w:val="en-US"/>
@@ -6713,47 +6769,47 @@
         </w:rPr>
         <w:t>orkflows</w:t>
       </w:r>
+      <w:bookmarkEnd w:id="11"/>
+      <w:r>
+        <w:rPr>
+          <w:lang w:val="en-US"/>
+        </w:rPr>
+        <w:t xml:space="preserve"> </w:t>
+      </w:r>
+    </w:p>
+    <w:p>
+      <w:pPr>
+        <w:pStyle w:val="berschrift2"/>
+        <w:rPr>
+          <w:lang w:val="en-US"/>
+        </w:rPr>
+      </w:pPr>
+      <w:bookmarkStart w:id="12" w:name="_Toc133605183"/>
+      <w:r>
+        <w:rPr>
+          <w:lang w:val="en-US"/>
+        </w:rPr>
+        <w:t xml:space="preserve">Create a </w:t>
+      </w:r>
+      <w:r>
+        <w:rPr>
+          <w:lang w:val="en-US"/>
+        </w:rPr>
+        <w:t>Yaml</w:t>
+      </w:r>
+      <w:r>
+        <w:rPr>
+          <w:lang w:val="en-US"/>
+        </w:rPr>
+        <w:t xml:space="preserve"> file with audio content</w:t>
+      </w:r>
+      <w:r>
+        <w:rPr>
+          <w:lang w:val="en-US"/>
+        </w:rPr>
+        <w:t>.</w:t>
+      </w:r>
       <w:bookmarkEnd w:id="12"/>
-      <w:r>
-        <w:rPr>
-          <w:lang w:val="en-US"/>
-        </w:rPr>
-        <w:t xml:space="preserve"> </w:t>
-      </w:r>
-    </w:p>
-    <w:p>
-      <w:pPr>
-        <w:pStyle w:val="berschrift2"/>
-        <w:rPr>
-          <w:lang w:val="en-US"/>
-        </w:rPr>
-      </w:pPr>
-      <w:bookmarkStart w:id="13" w:name="_Toc133605183"/>
-      <w:r>
-        <w:rPr>
-          <w:lang w:val="en-US"/>
-        </w:rPr>
-        <w:t xml:space="preserve">Create a </w:t>
-      </w:r>
-      <w:r>
-        <w:rPr>
-          <w:lang w:val="en-US"/>
-        </w:rPr>
-        <w:t>Yaml</w:t>
-      </w:r>
-      <w:r>
-        <w:rPr>
-          <w:lang w:val="en-US"/>
-        </w:rPr>
-        <w:t xml:space="preserve"> file with audio content</w:t>
-      </w:r>
-      <w:r>
-        <w:rPr>
-          <w:lang w:val="en-US"/>
-        </w:rPr>
-        <w:t>.</w:t>
-      </w:r>
-      <w:bookmarkEnd w:id="13"/>
     </w:p>
     <w:p>
       <w:pPr>
@@ -7036,7 +7092,7 @@
           <w:lang w:val="en-US"/>
         </w:rPr>
       </w:pPr>
-      <w:bookmarkStart w:id="14" w:name="_Toc133605184"/>
+      <w:bookmarkStart w:id="13" w:name="_Toc133605184"/>
       <w:r>
         <w:rPr>
           <w:lang w:val="en-US"/>
@@ -7049,7 +7105,7 @@
         </w:rPr>
         <w:t>.</w:t>
       </w:r>
-      <w:bookmarkEnd w:id="14"/>
+      <w:bookmarkEnd w:id="13"/>
     </w:p>
     <w:p>
       <w:pPr>
@@ -7259,7 +7315,7 @@
           <w:lang w:val="en-US"/>
         </w:rPr>
       </w:pPr>
-      <w:bookmarkStart w:id="15" w:name="_Toc133605185"/>
+      <w:bookmarkStart w:id="14" w:name="_Toc133605185"/>
       <w:r>
         <w:rPr>
           <w:lang w:val="en-US"/>
@@ -7267,7 +7323,7 @@
         <w:lastRenderedPageBreak/>
         <w:t>Map a room to an audio file</w:t>
       </w:r>
-      <w:bookmarkEnd w:id="15"/>
+      <w:bookmarkEnd w:id="14"/>
     </w:p>
     <w:p>
       <w:pPr>
@@ -7668,7 +7724,7 @@
 </file>
 
 <file path=word/endnotes.xml><?xml version="1.0" encoding="utf-8"?>
-<w:endnotes xmlns:wpc="http://schemas.microsoft.com/office/word/2010/wordprocessingCanvas" xmlns:cx="http://schemas.microsoft.com/office/drawing/2014/chartex" xmlns:cx1="http://schemas.microsoft.com/office/drawing/2015/9/8/chartex" xmlns:mc="http://schemas.openxmlformats.org/markup-compatibility/2006" xmlns:o="urn:schemas-microsoft-com:office:office" xmlns:r="http://schemas.openxmlformats.org/officeDocument/2006/relationships" xmlns:m="http://schemas.openxmlformats.org/officeDocument/2006/math" xmlns:v="urn:schemas-microsoft-com:vml" xmlns:wp14="http://schemas.microsoft.com/office/word/2010/wordprocessingDrawing" xmlns:wp="http://schemas.openxmlformats.org/drawingml/2006/wordprocessingDrawing" xmlns:w10="urn:schemas-microsoft-com:office:word" xmlns:w="http://schemas.openxmlformats.org/wordprocessingml/2006/main" xmlns:w14="http://schemas.microsoft.com/office/word/2010/wordml" xmlns:w15="http://schemas.microsoft.com/office/word/2012/wordml" xmlns:w16se="http://schemas.microsoft.com/office/word/2015/wordml/symex" xmlns:wpg="http://schemas.microsoft.com/office/word/2010/wordprocessingGroup" xmlns:wpi="http://schemas.microsoft.com/office/word/2010/wordprocessingInk" xmlns:wne="http://schemas.microsoft.com/office/word/2006/wordml" xmlns:wps="http://schemas.microsoft.com/office/word/2010/wordprocessingShape" mc:Ignorable="w14 w15 w16se wp14">
+<w:endnotes xmlns:wpc="http://schemas.microsoft.com/office/word/2010/wordprocessingCanvas" xmlns:cx="http://schemas.microsoft.com/office/drawing/2014/chartex" xmlns:cx1="http://schemas.microsoft.com/office/drawing/2015/9/8/chartex" xmlns:cx2="http://schemas.microsoft.com/office/drawing/2015/10/21/chartex" xmlns:cx3="http://schemas.microsoft.com/office/drawing/2016/5/9/chartex" xmlns:cx4="http://schemas.microsoft.com/office/drawing/2016/5/10/chartex" xmlns:cx5="http://schemas.microsoft.com/office/drawing/2016/5/11/chartex" xmlns:cx6="http://schemas.microsoft.com/office/drawing/2016/5/12/chartex" xmlns:cx7="http://schemas.microsoft.com/office/drawing/2016/5/13/chartex" xmlns:cx8="http://schemas.microsoft.com/office/drawing/2016/5/14/chartex" xmlns:mc="http://schemas.openxmlformats.org/markup-compatibility/2006" xmlns:aink="http://schemas.microsoft.com/office/drawing/2016/ink" xmlns:am3d="http://schemas.microsoft.com/office/drawing/2017/model3d" xmlns:o="urn:schemas-microsoft-com:office:office" xmlns:oel="http://schemas.microsoft.com/office/2019/extlst" xmlns:r="http://schemas.openxmlformats.org/officeDocument/2006/relationships" xmlns:m="http://schemas.openxmlformats.org/officeDocument/2006/math" xmlns:v="urn:schemas-microsoft-com:vml" xmlns:wp14="http://schemas.microsoft.com/office/word/2010/wordprocessingDrawing" xmlns:wp="http://schemas.openxmlformats.org/drawingml/2006/wordprocessingDrawing" xmlns:w10="urn:schemas-microsoft-com:office:word" xmlns:w="http://schemas.openxmlformats.org/wordprocessingml/2006/main" xmlns:w14="http://schemas.microsoft.com/office/word/2010/wordml" xmlns:w15="http://schemas.microsoft.com/office/word/2012/wordml" xmlns:w16cex="http://schemas.microsoft.com/office/word/2018/wordml/cex" xmlns:w16cid="http://schemas.microsoft.com/office/word/2016/wordml/cid" xmlns:w16="http://schemas.microsoft.com/office/word/2018/wordml" xmlns:w16du="http://schemas.microsoft.com/office/word/2023/wordml/word16du" xmlns:w16sdtdh="http://schemas.microsoft.com/office/word/2020/wordml/sdtdatahash" xmlns:w16sdtfl="http://schemas.microsoft.com/office/word/2024/wordml/sdtformatlock" xmlns:w16se="http://schemas.microsoft.com/office/word/2015/wordml/symex" xmlns:wpg="http://schemas.microsoft.com/office/word/2010/wordprocessingGroup" xmlns:wpi="http://schemas.microsoft.com/office/word/2010/wordprocessingInk" xmlns:wne="http://schemas.microsoft.com/office/word/2006/wordml" xmlns:wps="http://schemas.microsoft.com/office/word/2010/wordprocessingShape" mc:Ignorable="w14 w15 w16se w16cid w16 w16cex w16sdtdh w16sdtfl w16du wp14">
   <w:endnote w:type="separator" w:id="-1">
     <w:p>
       <w:pPr>
@@ -7693,7 +7749,7 @@
 </file>
 
 <file path=word/footer1.xml><?xml version="1.0" encoding="utf-8"?>
-<w:ftr xmlns:wpc="http://schemas.microsoft.com/office/word/2010/wordprocessingCanvas" xmlns:cx="http://schemas.microsoft.com/office/drawing/2014/chartex" xmlns:cx1="http://schemas.microsoft.com/office/drawing/2015/9/8/chartex" xmlns:mc="http://schemas.openxmlformats.org/markup-compatibility/2006" xmlns:o="urn:schemas-microsoft-com:office:office" xmlns:r="http://schemas.openxmlformats.org/officeDocument/2006/relationships" xmlns:m="http://schemas.openxmlformats.org/officeDocument/2006/math" xmlns:v="urn:schemas-microsoft-com:vml" xmlns:wp14="http://schemas.microsoft.com/office/word/2010/wordprocessingDrawing" xmlns:wp="http://schemas.openxmlformats.org/drawingml/2006/wordprocessingDrawing" xmlns:w10="urn:schemas-microsoft-com:office:word" xmlns:w="http://schemas.openxmlformats.org/wordprocessingml/2006/main" xmlns:w14="http://schemas.microsoft.com/office/word/2010/wordml" xmlns:w15="http://schemas.microsoft.com/office/word/2012/wordml" xmlns:w16se="http://schemas.microsoft.com/office/word/2015/wordml/symex" xmlns:wpg="http://schemas.microsoft.com/office/word/2010/wordprocessingGroup" xmlns:wpi="http://schemas.microsoft.com/office/word/2010/wordprocessingInk" xmlns:wne="http://schemas.microsoft.com/office/word/2006/wordml" xmlns:wps="http://schemas.microsoft.com/office/word/2010/wordprocessingShape" mc:Ignorable="w14 w15 w16se wp14">
+<w:ftr xmlns:wpc="http://schemas.microsoft.com/office/word/2010/wordprocessingCanvas" xmlns:cx="http://schemas.microsoft.com/office/drawing/2014/chartex" xmlns:cx1="http://schemas.microsoft.com/office/drawing/2015/9/8/chartex" xmlns:cx2="http://schemas.microsoft.com/office/drawing/2015/10/21/chartex" xmlns:cx3="http://schemas.microsoft.com/office/drawing/2016/5/9/chartex" xmlns:cx4="http://schemas.microsoft.com/office/drawing/2016/5/10/chartex" xmlns:cx5="http://schemas.microsoft.com/office/drawing/2016/5/11/chartex" xmlns:cx6="http://schemas.microsoft.com/office/drawing/2016/5/12/chartex" xmlns:cx7="http://schemas.microsoft.com/office/drawing/2016/5/13/chartex" xmlns:cx8="http://schemas.microsoft.com/office/drawing/2016/5/14/chartex" xmlns:mc="http://schemas.openxmlformats.org/markup-compatibility/2006" xmlns:aink="http://schemas.microsoft.com/office/drawing/2016/ink" xmlns:am3d="http://schemas.microsoft.com/office/drawing/2017/model3d" xmlns:o="urn:schemas-microsoft-com:office:office" xmlns:oel="http://schemas.microsoft.com/office/2019/extlst" xmlns:r="http://schemas.openxmlformats.org/officeDocument/2006/relationships" xmlns:m="http://schemas.openxmlformats.org/officeDocument/2006/math" xmlns:v="urn:schemas-microsoft-com:vml" xmlns:wp14="http://schemas.microsoft.com/office/word/2010/wordprocessingDrawing" xmlns:wp="http://schemas.openxmlformats.org/drawingml/2006/wordprocessingDrawing" xmlns:w10="urn:schemas-microsoft-com:office:word" xmlns:w="http://schemas.openxmlformats.org/wordprocessingml/2006/main" xmlns:w14="http://schemas.microsoft.com/office/word/2010/wordml" xmlns:w15="http://schemas.microsoft.com/office/word/2012/wordml" xmlns:w16cex="http://schemas.microsoft.com/office/word/2018/wordml/cex" xmlns:w16cid="http://schemas.microsoft.com/office/word/2016/wordml/cid" xmlns:w16="http://schemas.microsoft.com/office/word/2018/wordml" xmlns:w16du="http://schemas.microsoft.com/office/word/2023/wordml/word16du" xmlns:w16sdtdh="http://schemas.microsoft.com/office/word/2020/wordml/sdtdatahash" xmlns:w16sdtfl="http://schemas.microsoft.com/office/word/2024/wordml/sdtformatlock" xmlns:w16se="http://schemas.microsoft.com/office/word/2015/wordml/symex" xmlns:wpg="http://schemas.microsoft.com/office/word/2010/wordprocessingGroup" xmlns:wpi="http://schemas.microsoft.com/office/word/2010/wordprocessingInk" xmlns:wne="http://schemas.microsoft.com/office/word/2006/wordml" xmlns:wps="http://schemas.microsoft.com/office/word/2010/wordprocessingShape" mc:Ignorable="w14 w15 w16se w16cid w16 w16cex w16sdtdh w16sdtfl w16du wp14">
   <w:sdt>
     <w:sdtPr>
       <w:id w:val="-792286328"/>
@@ -7702,7 +7758,6 @@
         <w:docPartUnique/>
       </w:docPartObj>
     </w:sdtPr>
-    <w:sdtEndPr/>
     <w:sdtContent>
       <w:p>
         <w:pPr>
@@ -7739,7 +7794,7 @@
 </file>
 
 <file path=word/footnotes.xml><?xml version="1.0" encoding="utf-8"?>
-<w:footnotes xmlns:wpc="http://schemas.microsoft.com/office/word/2010/wordprocessingCanvas" xmlns:cx="http://schemas.microsoft.com/office/drawing/2014/chartex" xmlns:cx1="http://schemas.microsoft.com/office/drawing/2015/9/8/chartex" xmlns:mc="http://schemas.openxmlformats.org/markup-compatibility/2006" xmlns:o="urn:schemas-microsoft-com:office:office" xmlns:r="http://schemas.openxmlformats.org/officeDocument/2006/relationships" xmlns:m="http://schemas.openxmlformats.org/officeDocument/2006/math" xmlns:v="urn:schemas-microsoft-com:vml" xmlns:wp14="http://schemas.microsoft.com/office/word/2010/wordprocessingDrawing" xmlns:wp="http://schemas.openxmlformats.org/drawingml/2006/wordprocessingDrawing" xmlns:w10="urn:schemas-microsoft-com:office:word" xmlns:w="http://schemas.openxmlformats.org/wordprocessingml/2006/main" xmlns:w14="http://schemas.microsoft.com/office/word/2010/wordml" xmlns:w15="http://schemas.microsoft.com/office/word/2012/wordml" xmlns:w16se="http://schemas.microsoft.com/office/word/2015/wordml/symex" xmlns:wpg="http://schemas.microsoft.com/office/word/2010/wordprocessingGroup" xmlns:wpi="http://schemas.microsoft.com/office/word/2010/wordprocessingInk" xmlns:wne="http://schemas.microsoft.com/office/word/2006/wordml" xmlns:wps="http://schemas.microsoft.com/office/word/2010/wordprocessingShape" mc:Ignorable="w14 w15 w16se wp14">
+<w:footnotes xmlns:wpc="http://schemas.microsoft.com/office/word/2010/wordprocessingCanvas" xmlns:cx="http://schemas.microsoft.com/office/drawing/2014/chartex" xmlns:cx1="http://schemas.microsoft.com/office/drawing/2015/9/8/chartex" xmlns:cx2="http://schemas.microsoft.com/office/drawing/2015/10/21/chartex" xmlns:cx3="http://schemas.microsoft.com/office/drawing/2016/5/9/chartex" xmlns:cx4="http://schemas.microsoft.com/office/drawing/2016/5/10/chartex" xmlns:cx5="http://schemas.microsoft.com/office/drawing/2016/5/11/chartex" xmlns:cx6="http://schemas.microsoft.com/office/drawing/2016/5/12/chartex" xmlns:cx7="http://schemas.microsoft.com/office/drawing/2016/5/13/chartex" xmlns:cx8="http://schemas.microsoft.com/office/drawing/2016/5/14/chartex" xmlns:mc="http://schemas.openxmlformats.org/markup-compatibility/2006" xmlns:aink="http://schemas.microsoft.com/office/drawing/2016/ink" xmlns:am3d="http://schemas.microsoft.com/office/drawing/2017/model3d" xmlns:o="urn:schemas-microsoft-com:office:office" xmlns:oel="http://schemas.microsoft.com/office/2019/extlst" xmlns:r="http://schemas.openxmlformats.org/officeDocument/2006/relationships" xmlns:m="http://schemas.openxmlformats.org/officeDocument/2006/math" xmlns:v="urn:schemas-microsoft-com:vml" xmlns:wp14="http://schemas.microsoft.com/office/word/2010/wordprocessingDrawing" xmlns:wp="http://schemas.openxmlformats.org/drawingml/2006/wordprocessingDrawing" xmlns:w10="urn:schemas-microsoft-com:office:word" xmlns:w="http://schemas.openxmlformats.org/wordprocessingml/2006/main" xmlns:w14="http://schemas.microsoft.com/office/word/2010/wordml" xmlns:w15="http://schemas.microsoft.com/office/word/2012/wordml" xmlns:w16cex="http://schemas.microsoft.com/office/word/2018/wordml/cex" xmlns:w16cid="http://schemas.microsoft.com/office/word/2016/wordml/cid" xmlns:w16="http://schemas.microsoft.com/office/word/2018/wordml" xmlns:w16du="http://schemas.microsoft.com/office/word/2023/wordml/word16du" xmlns:w16sdtdh="http://schemas.microsoft.com/office/word/2020/wordml/sdtdatahash" xmlns:w16sdtfl="http://schemas.microsoft.com/office/word/2024/wordml/sdtformatlock" xmlns:w16se="http://schemas.microsoft.com/office/word/2015/wordml/symex" xmlns:wpg="http://schemas.microsoft.com/office/word/2010/wordprocessingGroup" xmlns:wpi="http://schemas.microsoft.com/office/word/2010/wordprocessingInk" xmlns:wne="http://schemas.microsoft.com/office/word/2006/wordml" xmlns:wps="http://schemas.microsoft.com/office/word/2010/wordprocessingShape" mc:Ignorable="w14 w15 w16se w16cid w16 w16cex w16sdtdh w16sdtfl w16du wp14">
   <w:footnote w:type="separator" w:id="-1">
     <w:p>
       <w:pPr>
@@ -7764,7 +7819,7 @@
 </file>
 
 <file path=word/numbering.xml><?xml version="1.0" encoding="utf-8"?>
-<w:numbering xmlns:wpc="http://schemas.microsoft.com/office/word/2010/wordprocessingCanvas" xmlns:cx="http://schemas.microsoft.com/office/drawing/2014/chartex" xmlns:cx1="http://schemas.microsoft.com/office/drawing/2015/9/8/chartex" xmlns:mc="http://schemas.openxmlformats.org/markup-compatibility/2006" xmlns:o="urn:schemas-microsoft-com:office:office" xmlns:r="http://schemas.openxmlformats.org/officeDocument/2006/relationships" xmlns:m="http://schemas.openxmlformats.org/officeDocument/2006/math" xmlns:v="urn:schemas-microsoft-com:vml" xmlns:wp14="http://schemas.microsoft.com/office/word/2010/wordprocessingDrawing" xmlns:wp="http://schemas.openxmlformats.org/drawingml/2006/wordprocessingDrawing" xmlns:w10="urn:schemas-microsoft-com:office:word" xmlns:w="http://schemas.openxmlformats.org/wordprocessingml/2006/main" xmlns:w14="http://schemas.microsoft.com/office/word/2010/wordml" xmlns:w15="http://schemas.microsoft.com/office/word/2012/wordml" xmlns:w16se="http://schemas.microsoft.com/office/word/2015/wordml/symex" xmlns:wpg="http://schemas.microsoft.com/office/word/2010/wordprocessingGroup" xmlns:wpi="http://schemas.microsoft.com/office/word/2010/wordprocessingInk" xmlns:wne="http://schemas.microsoft.com/office/word/2006/wordml" xmlns:wps="http://schemas.microsoft.com/office/word/2010/wordprocessingShape" mc:Ignorable="w14 w15 w16se wp14">
+<w:numbering xmlns:wpc="http://schemas.microsoft.com/office/word/2010/wordprocessingCanvas" xmlns:cx="http://schemas.microsoft.com/office/drawing/2014/chartex" xmlns:cx1="http://schemas.microsoft.com/office/drawing/2015/9/8/chartex" xmlns:cx2="http://schemas.microsoft.com/office/drawing/2015/10/21/chartex" xmlns:cx3="http://schemas.microsoft.com/office/drawing/2016/5/9/chartex" xmlns:cx4="http://schemas.microsoft.com/office/drawing/2016/5/10/chartex" xmlns:cx5="http://schemas.microsoft.com/office/drawing/2016/5/11/chartex" xmlns:cx6="http://schemas.microsoft.com/office/drawing/2016/5/12/chartex" xmlns:cx7="http://schemas.microsoft.com/office/drawing/2016/5/13/chartex" xmlns:cx8="http://schemas.microsoft.com/office/drawing/2016/5/14/chartex" xmlns:mc="http://schemas.openxmlformats.org/markup-compatibility/2006" xmlns:aink="http://schemas.microsoft.com/office/drawing/2016/ink" xmlns:am3d="http://schemas.microsoft.com/office/drawing/2017/model3d" xmlns:o="urn:schemas-microsoft-com:office:office" xmlns:oel="http://schemas.microsoft.com/office/2019/extlst" xmlns:r="http://schemas.openxmlformats.org/officeDocument/2006/relationships" xmlns:m="http://schemas.openxmlformats.org/officeDocument/2006/math" xmlns:v="urn:schemas-microsoft-com:vml" xmlns:wp14="http://schemas.microsoft.com/office/word/2010/wordprocessingDrawing" xmlns:wp="http://schemas.openxmlformats.org/drawingml/2006/wordprocessingDrawing" xmlns:w10="urn:schemas-microsoft-com:office:word" xmlns:w="http://schemas.openxmlformats.org/wordprocessingml/2006/main" xmlns:w14="http://schemas.microsoft.com/office/word/2010/wordml" xmlns:w15="http://schemas.microsoft.com/office/word/2012/wordml" xmlns:w16cex="http://schemas.microsoft.com/office/word/2018/wordml/cex" xmlns:w16cid="http://schemas.microsoft.com/office/word/2016/wordml/cid" xmlns:w16="http://schemas.microsoft.com/office/word/2018/wordml" xmlns:w16du="http://schemas.microsoft.com/office/word/2023/wordml/word16du" xmlns:w16sdtdh="http://schemas.microsoft.com/office/word/2020/wordml/sdtdatahash" xmlns:w16sdtfl="http://schemas.microsoft.com/office/word/2024/wordml/sdtformatlock" xmlns:w16se="http://schemas.microsoft.com/office/word/2015/wordml/symex" xmlns:wpg="http://schemas.microsoft.com/office/word/2010/wordprocessingGroup" xmlns:wpi="http://schemas.microsoft.com/office/word/2010/wordprocessingInk" xmlns:wne="http://schemas.microsoft.com/office/word/2006/wordml" xmlns:wps="http://schemas.microsoft.com/office/word/2010/wordprocessingShape" mc:Ignorable="w14 w15 w16se w16cid w16 w16cex w16sdtdh w16sdtfl w16du wp14">
   <w:abstractNum w:abstractNumId="0" w15:restartNumberingAfterBreak="0">
     <w:nsid w:val="08845217"/>
     <w:multiLevelType w:val="hybridMultilevel"/>
@@ -8590,38 +8645,38 @@
       </w:pPr>
     </w:lvl>
   </w:abstractNum>
-  <w:num w:numId="1">
+  <w:num w:numId="1" w16cid:durableId="1440876892">
     <w:abstractNumId w:val="7"/>
   </w:num>
-  <w:num w:numId="2">
+  <w:num w:numId="2" w16cid:durableId="1586724515">
     <w:abstractNumId w:val="1"/>
   </w:num>
-  <w:num w:numId="3">
+  <w:num w:numId="3" w16cid:durableId="1666129463">
     <w:abstractNumId w:val="5"/>
   </w:num>
-  <w:num w:numId="4">
+  <w:num w:numId="4" w16cid:durableId="1407068318">
     <w:abstractNumId w:val="8"/>
   </w:num>
-  <w:num w:numId="5">
+  <w:num w:numId="5" w16cid:durableId="22681621">
     <w:abstractNumId w:val="2"/>
   </w:num>
-  <w:num w:numId="6">
+  <w:num w:numId="6" w16cid:durableId="1558323956">
     <w:abstractNumId w:val="3"/>
   </w:num>
-  <w:num w:numId="7">
+  <w:num w:numId="7" w16cid:durableId="650715616">
     <w:abstractNumId w:val="6"/>
   </w:num>
-  <w:num w:numId="8">
+  <w:num w:numId="8" w16cid:durableId="545338597">
     <w:abstractNumId w:val="4"/>
   </w:num>
-  <w:num w:numId="9">
+  <w:num w:numId="9" w16cid:durableId="177624283">
     <w:abstractNumId w:val="0"/>
   </w:num>
 </w:numbering>
 </file>
 
 <file path=word/styles.xml><?xml version="1.0" encoding="utf-8"?>
-<w:styles xmlns:mc="http://schemas.openxmlformats.org/markup-compatibility/2006" xmlns:r="http://schemas.openxmlformats.org/officeDocument/2006/relationships" xmlns:w="http://schemas.openxmlformats.org/wordprocessingml/2006/main" xmlns:w14="http://schemas.microsoft.com/office/word/2010/wordml" xmlns:w15="http://schemas.microsoft.com/office/word/2012/wordml" xmlns:w16se="http://schemas.microsoft.com/office/word/2015/wordml/symex" mc:Ignorable="w14 w15 w16se">
+<w:styles xmlns:mc="http://schemas.openxmlformats.org/markup-compatibility/2006" xmlns:r="http://schemas.openxmlformats.org/officeDocument/2006/relationships" xmlns:w="http://schemas.openxmlformats.org/wordprocessingml/2006/main" xmlns:w14="http://schemas.microsoft.com/office/word/2010/wordml" xmlns:w15="http://schemas.microsoft.com/office/word/2012/wordml" xmlns:w16cex="http://schemas.microsoft.com/office/word/2018/wordml/cex" xmlns:w16cid="http://schemas.microsoft.com/office/word/2016/wordml/cid" xmlns:w16="http://schemas.microsoft.com/office/word/2018/wordml" xmlns:w16du="http://schemas.microsoft.com/office/word/2023/wordml/word16du" xmlns:w16sdtdh="http://schemas.microsoft.com/office/word/2020/wordml/sdtdatahash" xmlns:w16sdtfl="http://schemas.microsoft.com/office/word/2024/wordml/sdtformatlock" xmlns:w16se="http://schemas.microsoft.com/office/word/2015/wordml/symex" mc:Ignorable="w14 w15 w16se w16cid w16 w16cex w16sdtdh w16sdtfl w16du">
   <w:docDefaults>
     <w:rPrDefault>
       <w:rPr>
@@ -8639,7 +8694,7 @@
       </w:pPr>
     </w:pPrDefault>
   </w:docDefaults>
-  <w:latentStyles w:defLockedState="0" w:defUIPriority="99" w:defSemiHidden="0" w:defUnhideWhenUsed="0" w:defQFormat="0" w:count="371">
+  <w:latentStyles w:defLockedState="0" w:defUIPriority="99" w:defSemiHidden="0" w:defUnhideWhenUsed="0" w:defQFormat="0" w:count="376">
     <w:lsdException w:name="Normal" w:uiPriority="0" w:qFormat="1"/>
     <w:lsdException w:name="heading 1" w:uiPriority="9" w:qFormat="1"/>
     <w:lsdException w:name="heading 2" w:semiHidden="1" w:uiPriority="9" w:unhideWhenUsed="1" w:qFormat="1"/>
@@ -9011,6 +9066,11 @@
     <w:lsdException w:name="List Table 5 Dark Accent 6" w:uiPriority="50"/>
     <w:lsdException w:name="List Table 6 Colorful Accent 6" w:uiPriority="51"/>
     <w:lsdException w:name="List Table 7 Colorful Accent 6" w:uiPriority="52"/>
+    <w:lsdException w:name="Mention" w:semiHidden="1" w:unhideWhenUsed="1"/>
+    <w:lsdException w:name="Smart Hyperlink" w:semiHidden="1" w:unhideWhenUsed="1"/>
+    <w:lsdException w:name="Hashtag" w:semiHidden="1" w:unhideWhenUsed="1"/>
+    <w:lsdException w:name="Unresolved Mention" w:semiHidden="1" w:unhideWhenUsed="1"/>
+    <w:lsdException w:name="Smart Link" w:semiHidden="1" w:unhideWhenUsed="1"/>
   </w:latentStyles>
   <w:style w:type="paragraph" w:default="1" w:styleId="Standard">
     <w:name w:val="Normal"/>

</xml_diff>

<commit_message>
Updated manual, waitcursor on audio processing
</commit_message>
<xml_diff>
--- a/Yaml AudioTool Rebuilt/Resources/Yaml Audio Tool Rebuilt - Manual.docx
+++ b/Yaml AudioTool Rebuilt/Resources/Yaml Audio Tool Rebuilt - Manual.docx
@@ -1833,7 +1833,7 @@
           <w:lang w:eastAsia="de-DE"/>
         </w:rPr>
         <w:drawing>
-          <wp:anchor distT="0" distB="0" distL="114300" distR="114300" simplePos="0" relativeHeight="251658240" behindDoc="0" locked="0" layoutInCell="1" allowOverlap="1" wp14:anchorId="09B06EAB" wp14:editId="4C8502A1">
+          <wp:anchor distT="0" distB="0" distL="114300" distR="114300" simplePos="0" relativeHeight="251658240" behindDoc="0" locked="0" layoutInCell="1" allowOverlap="1" wp14:anchorId="09B06EAB" wp14:editId="2BEAFFE8">
             <wp:simplePos x="0" y="0"/>
             <wp:positionH relativeFrom="margin">
               <wp:align>center</wp:align>
@@ -5582,13 +5582,13 @@
         <mc:AlternateContent>
           <mc:Choice Requires="wps">
             <w:drawing>
-              <wp:anchor distT="0" distB="0" distL="114300" distR="114300" simplePos="0" relativeHeight="251679744" behindDoc="0" locked="0" layoutInCell="1" allowOverlap="1" wp14:anchorId="43B4C91D" wp14:editId="0E93067F">
+              <wp:anchor distT="0" distB="0" distL="114300" distR="114300" simplePos="0" relativeHeight="251679744" behindDoc="0" locked="0" layoutInCell="1" allowOverlap="1" wp14:anchorId="43B4C91D" wp14:editId="5693CC01">
                 <wp:simplePos x="0" y="0"/>
                 <wp:positionH relativeFrom="column">
                   <wp:posOffset>5742940</wp:posOffset>
                 </wp:positionH>
                 <wp:positionV relativeFrom="paragraph">
-                  <wp:posOffset>1462405</wp:posOffset>
+                  <wp:posOffset>1176655</wp:posOffset>
                 </wp:positionV>
                 <wp:extent cx="342900" cy="342900"/>
                 <wp:effectExtent l="0" t="0" r="19050" b="19050"/>
@@ -5670,7 +5670,7 @@
           </mc:Choice>
           <mc:Fallback>
             <w:pict>
-              <v:roundrect w14:anchorId="43B4C91D" id="_x0000_s1035" style="position:absolute;margin-left:452.2pt;margin-top:115.15pt;width:27pt;height:27pt;z-index:251679744;visibility:visible;mso-wrap-style:square;mso-width-percent:0;mso-height-percent:0;mso-wrap-distance-left:9pt;mso-wrap-distance-top:0;mso-wrap-distance-right:9pt;mso-wrap-distance-bottom:0;mso-position-horizontal:absolute;mso-position-horizontal-relative:text;mso-position-vertical:absolute;mso-position-vertical-relative:text;mso-width-percent:0;mso-height-percent:0;mso-width-relative:margin;mso-height-relative:margin;v-text-anchor:middle" arcsize="10923f" o:gfxdata="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" fillcolor="white [3212]" strokecolor="black [3200]" strokeweight="1pt">
+              <v:roundrect w14:anchorId="43B4C91D" id="_x0000_s1035" style="position:absolute;margin-left:452.2pt;margin-top:92.65pt;width:27pt;height:27pt;z-index:251679744;visibility:visible;mso-wrap-style:square;mso-width-percent:0;mso-height-percent:0;mso-wrap-distance-left:9pt;mso-wrap-distance-top:0;mso-wrap-distance-right:9pt;mso-wrap-distance-bottom:0;mso-position-horizontal:absolute;mso-position-horizontal-relative:text;mso-position-vertical:absolute;mso-position-vertical-relative:text;mso-width-percent:0;mso-height-percent:0;mso-width-relative:margin;mso-height-relative:margin;v-text-anchor:middle" arcsize="10923f" o:gfxdata="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" fillcolor="white [3212]" strokecolor="black [3200]" strokeweight="1pt">
                 <v:stroke joinstyle="miter"/>
                 <v:textbox>
                   <w:txbxContent>
@@ -5706,86 +5706,16 @@
           <w:noProof/>
           <w:lang w:eastAsia="de-DE"/>
         </w:rPr>
-        <w:drawing>
-          <wp:anchor distT="0" distB="0" distL="114300" distR="114300" simplePos="0" relativeHeight="251677696" behindDoc="0" locked="0" layoutInCell="1" allowOverlap="1" wp14:anchorId="472F444B" wp14:editId="5CBCA7FA">
-            <wp:simplePos x="0" y="0"/>
-            <wp:positionH relativeFrom="margin">
-              <wp:posOffset>1905</wp:posOffset>
-            </wp:positionH>
-            <wp:positionV relativeFrom="paragraph">
-              <wp:posOffset>444500</wp:posOffset>
-            </wp:positionV>
-            <wp:extent cx="5760720" cy="2540635"/>
-            <wp:effectExtent l="0" t="0" r="0" b="0"/>
-            <wp:wrapSquare wrapText="bothSides"/>
-            <wp:docPr id="446261485" name="Grafik 1"/>
-            <wp:cNvGraphicFramePr>
-              <a:graphicFrameLocks xmlns:a="http://schemas.openxmlformats.org/drawingml/2006/main" noChangeAspect="1"/>
-            </wp:cNvGraphicFramePr>
-            <a:graphic xmlns:a="http://schemas.openxmlformats.org/drawingml/2006/main">
-              <a:graphicData uri="http://schemas.openxmlformats.org/drawingml/2006/picture">
-                <pic:pic xmlns:pic="http://schemas.openxmlformats.org/drawingml/2006/picture">
-                  <pic:nvPicPr>
-                    <pic:cNvPr id="446261485" name="Grafik 1"/>
-                    <pic:cNvPicPr/>
-                  </pic:nvPicPr>
-                  <pic:blipFill>
-                    <a:blip r:embed="rId12" cstate="print">
-                      <a:extLst>
-                        <a:ext uri="{28A0092B-C50C-407E-A947-70E740481C1C}">
-                          <a14:useLocalDpi xmlns:a14="http://schemas.microsoft.com/office/drawing/2010/main" val="0"/>
-                        </a:ext>
-                      </a:extLst>
-                    </a:blip>
-                    <a:srcRect t="402" b="402"/>
-                    <a:stretch>
-                      <a:fillRect/>
-                    </a:stretch>
-                  </pic:blipFill>
-                  <pic:spPr bwMode="auto">
-                    <a:xfrm>
-                      <a:off x="0" y="0"/>
-                      <a:ext cx="5760720" cy="2540635"/>
-                    </a:xfrm>
-                    <a:prstGeom prst="rect">
-                      <a:avLst/>
-                    </a:prstGeom>
-                    <a:ln>
-                      <a:noFill/>
-                    </a:ln>
-                    <a:extLst>
-                      <a:ext uri="{53640926-AAD7-44D8-BBD7-CCE9431645EC}">
-                        <a14:shadowObscured xmlns:a14="http://schemas.microsoft.com/office/drawing/2010/main"/>
-                      </a:ext>
-                    </a:extLst>
-                  </pic:spPr>
-                </pic:pic>
-              </a:graphicData>
-            </a:graphic>
-            <wp14:sizeRelH relativeFrom="margin">
-              <wp14:pctWidth>0</wp14:pctWidth>
-            </wp14:sizeRelH>
-            <wp14:sizeRelV relativeFrom="margin">
-              <wp14:pctHeight>0</wp14:pctHeight>
-            </wp14:sizeRelV>
-          </wp:anchor>
-        </w:drawing>
-      </w:r>
-      <w:r>
-        <w:rPr>
-          <w:noProof/>
-          <w:lang w:eastAsia="de-DE"/>
-        </w:rPr>
         <mc:AlternateContent>
           <mc:Choice Requires="wps">
             <w:drawing>
-              <wp:anchor distT="0" distB="0" distL="114300" distR="114300" simplePos="0" relativeHeight="251681792" behindDoc="0" locked="0" layoutInCell="1" allowOverlap="1" wp14:anchorId="28F9E3E8" wp14:editId="6F3B4AC1">
+              <wp:anchor distT="0" distB="0" distL="114300" distR="114300" simplePos="0" relativeHeight="251681792" behindDoc="0" locked="0" layoutInCell="1" allowOverlap="1" wp14:anchorId="28F9E3E8" wp14:editId="2B3620C4">
                 <wp:simplePos x="0" y="0"/>
                 <wp:positionH relativeFrom="column">
                   <wp:posOffset>5156200</wp:posOffset>
                 </wp:positionH>
                 <wp:positionV relativeFrom="paragraph">
-                  <wp:posOffset>3048635</wp:posOffset>
+                  <wp:posOffset>2762885</wp:posOffset>
                 </wp:positionV>
                 <wp:extent cx="342900" cy="342900"/>
                 <wp:effectExtent l="0" t="0" r="19050" b="19050"/>
@@ -5867,7 +5797,7 @@
           </mc:Choice>
           <mc:Fallback>
             <w:pict>
-              <v:roundrect w14:anchorId="28F9E3E8" id="_x0000_s1036" style="position:absolute;margin-left:406pt;margin-top:240.05pt;width:27pt;height:27pt;z-index:251681792;visibility:visible;mso-wrap-style:square;mso-width-percent:0;mso-height-percent:0;mso-wrap-distance-left:9pt;mso-wrap-distance-top:0;mso-wrap-distance-right:9pt;mso-wrap-distance-bottom:0;mso-position-horizontal:absolute;mso-position-horizontal-relative:text;mso-position-vertical:absolute;mso-position-vertical-relative:text;mso-width-percent:0;mso-height-percent:0;mso-width-relative:margin;mso-height-relative:margin;v-text-anchor:middle" arcsize="10923f" o:gfxdata="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" fillcolor="white [3212]" strokecolor="black [3200]" strokeweight="1pt">
+              <v:roundrect w14:anchorId="28F9E3E8" id="_x0000_s1036" style="position:absolute;margin-left:406pt;margin-top:217.55pt;width:27pt;height:27pt;z-index:251681792;visibility:visible;mso-wrap-style:square;mso-width-percent:0;mso-height-percent:0;mso-wrap-distance-left:9pt;mso-wrap-distance-top:0;mso-wrap-distance-right:9pt;mso-wrap-distance-bottom:0;mso-position-horizontal:absolute;mso-position-horizontal-relative:text;mso-position-vertical:absolute;mso-position-vertical-relative:text;mso-width-percent:0;mso-height-percent:0;mso-width-relative:margin;mso-height-relative:margin;v-text-anchor:middle" arcsize="10923f" o:gfxdata="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" fillcolor="white [3212]" strokecolor="black [3200]" strokeweight="1pt">
                 <v:stroke joinstyle="miter"/>
                 <v:textbox>
                   <w:txbxContent>
@@ -5906,13 +5836,13 @@
         <mc:AlternateContent>
           <mc:Choice Requires="wps">
             <w:drawing>
-              <wp:anchor distT="0" distB="0" distL="114300" distR="114300" simplePos="0" relativeHeight="251680768" behindDoc="0" locked="0" layoutInCell="1" allowOverlap="1" wp14:anchorId="156AF791" wp14:editId="50AFC6AC">
+              <wp:anchor distT="0" distB="0" distL="114300" distR="114300" simplePos="0" relativeHeight="251680768" behindDoc="0" locked="0" layoutInCell="1" allowOverlap="1" wp14:anchorId="156AF791" wp14:editId="59624D23">
                 <wp:simplePos x="0" y="0"/>
                 <wp:positionH relativeFrom="column">
                   <wp:posOffset>2296795</wp:posOffset>
                 </wp:positionH>
                 <wp:positionV relativeFrom="paragraph">
-                  <wp:posOffset>3046730</wp:posOffset>
+                  <wp:posOffset>2760980</wp:posOffset>
                 </wp:positionV>
                 <wp:extent cx="342900" cy="342900"/>
                 <wp:effectExtent l="0" t="0" r="19050" b="19050"/>
@@ -6005,7 +5935,7 @@
           </mc:Choice>
           <mc:Fallback>
             <w:pict>
-              <v:roundrect w14:anchorId="156AF791" id="_x0000_s1037" style="position:absolute;margin-left:180.85pt;margin-top:239.9pt;width:27pt;height:27pt;z-index:251680768;visibility:visible;mso-wrap-style:square;mso-width-percent:0;mso-height-percent:0;mso-wrap-distance-left:9pt;mso-wrap-distance-top:0;mso-wrap-distance-right:9pt;mso-wrap-distance-bottom:0;mso-position-horizontal:absolute;mso-position-horizontal-relative:text;mso-position-vertical:absolute;mso-position-vertical-relative:text;mso-width-percent:0;mso-height-percent:0;mso-width-relative:margin;mso-height-relative:margin;v-text-anchor:middle" arcsize="10923f" o:gfxdata="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" fillcolor="white [3212]" strokecolor="black [3200]" strokeweight="1pt">
+              <v:roundrect w14:anchorId="156AF791" id="_x0000_s1037" style="position:absolute;margin-left:180.85pt;margin-top:217.4pt;width:27pt;height:27pt;z-index:251680768;visibility:visible;mso-wrap-style:square;mso-width-percent:0;mso-height-percent:0;mso-wrap-distance-left:9pt;mso-wrap-distance-top:0;mso-wrap-distance-right:9pt;mso-wrap-distance-bottom:0;mso-position-horizontal:absolute;mso-position-horizontal-relative:text;mso-position-vertical:absolute;mso-position-vertical-relative:text;mso-width-percent:0;mso-height-percent:0;mso-width-relative:margin;mso-height-relative:margin;v-text-anchor:middle" arcsize="10923f" o:gfxdata="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" fillcolor="white [3212]" strokecolor="black [3200]" strokeweight="1pt">
                 <v:stroke joinstyle="miter"/>
                 <v:textbox>
                   <w:txbxContent>
@@ -6055,13 +5985,13 @@
         <mc:AlternateContent>
           <mc:Choice Requires="wps">
             <w:drawing>
-              <wp:anchor distT="0" distB="0" distL="114300" distR="114300" simplePos="0" relativeHeight="251678720" behindDoc="0" locked="0" layoutInCell="1" allowOverlap="1" wp14:anchorId="0BE118CA" wp14:editId="396D0065">
+              <wp:anchor distT="0" distB="0" distL="114300" distR="114300" simplePos="0" relativeHeight="251678720" behindDoc="0" locked="0" layoutInCell="1" allowOverlap="1" wp14:anchorId="0BE118CA" wp14:editId="39558615">
                 <wp:simplePos x="0" y="0"/>
                 <wp:positionH relativeFrom="column">
                   <wp:posOffset>2292350</wp:posOffset>
                 </wp:positionH>
                 <wp:positionV relativeFrom="paragraph">
-                  <wp:posOffset>1462405</wp:posOffset>
+                  <wp:posOffset>1176655</wp:posOffset>
                 </wp:positionV>
                 <wp:extent cx="342900" cy="342900"/>
                 <wp:effectExtent l="0" t="0" r="19050" b="19050"/>
@@ -6143,7 +6073,7 @@
           </mc:Choice>
           <mc:Fallback>
             <w:pict>
-              <v:roundrect w14:anchorId="0BE118CA" id="_x0000_s1038" style="position:absolute;margin-left:180.5pt;margin-top:115.15pt;width:27pt;height:27pt;z-index:251678720;visibility:visible;mso-wrap-style:square;mso-width-percent:0;mso-height-percent:0;mso-wrap-distance-left:9pt;mso-wrap-distance-top:0;mso-wrap-distance-right:9pt;mso-wrap-distance-bottom:0;mso-position-horizontal:absolute;mso-position-horizontal-relative:text;mso-position-vertical:absolute;mso-position-vertical-relative:text;mso-width-percent:0;mso-height-percent:0;mso-width-relative:margin;mso-height-relative:margin;v-text-anchor:middle" arcsize="10923f" o:gfxdata="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" fillcolor="white [3212]" strokecolor="black [3200]" strokeweight="1pt">
+              <v:roundrect w14:anchorId="0BE118CA" id="_x0000_s1038" style="position:absolute;margin-left:180.5pt;margin-top:92.65pt;width:27pt;height:27pt;z-index:251678720;visibility:visible;mso-wrap-style:square;mso-width-percent:0;mso-height-percent:0;mso-wrap-distance-left:9pt;mso-wrap-distance-top:0;mso-wrap-distance-right:9pt;mso-wrap-distance-bottom:0;mso-position-horizontal:absolute;mso-position-horizontal-relative:text;mso-position-vertical:absolute;mso-position-vertical-relative:text;mso-width-percent:0;mso-height-percent:0;mso-width-relative:margin;mso-height-relative:margin;v-text-anchor:middle" arcsize="10923f" o:gfxdata="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" fillcolor="white [3212]" strokecolor="black [3200]" strokeweight="1pt">
                 <v:stroke joinstyle="miter"/>
                 <v:textbox>
                   <w:txbxContent>
@@ -6174,6 +6104,76 @@
           </mc:Fallback>
         </mc:AlternateContent>
       </w:r>
+      <w:r>
+        <w:rPr>
+          <w:noProof/>
+          <w:lang w:eastAsia="de-DE"/>
+        </w:rPr>
+        <w:drawing>
+          <wp:anchor distT="0" distB="0" distL="114300" distR="114300" simplePos="0" relativeHeight="251677696" behindDoc="0" locked="0" layoutInCell="1" allowOverlap="1" wp14:anchorId="472F444B" wp14:editId="19B2BE66">
+            <wp:simplePos x="0" y="0"/>
+            <wp:positionH relativeFrom="margin">
+              <wp:align>center</wp:align>
+            </wp:positionH>
+            <wp:positionV relativeFrom="paragraph">
+              <wp:posOffset>219075</wp:posOffset>
+            </wp:positionV>
+            <wp:extent cx="6086475" cy="2540635"/>
+            <wp:effectExtent l="0" t="0" r="9525" b="0"/>
+            <wp:wrapSquare wrapText="bothSides"/>
+            <wp:docPr id="446261485" name="Grafik 1"/>
+            <wp:cNvGraphicFramePr>
+              <a:graphicFrameLocks xmlns:a="http://schemas.openxmlformats.org/drawingml/2006/main" noChangeAspect="1"/>
+            </wp:cNvGraphicFramePr>
+            <a:graphic xmlns:a="http://schemas.openxmlformats.org/drawingml/2006/main">
+              <a:graphicData uri="http://schemas.openxmlformats.org/drawingml/2006/picture">
+                <pic:pic xmlns:pic="http://schemas.openxmlformats.org/drawingml/2006/picture">
+                  <pic:nvPicPr>
+                    <pic:cNvPr id="446261485" name="Grafik 1"/>
+                    <pic:cNvPicPr/>
+                  </pic:nvPicPr>
+                  <pic:blipFill rotWithShape="1">
+                    <a:blip r:embed="rId12">
+                      <a:extLst>
+                        <a:ext uri="{28A0092B-C50C-407E-A947-70E740481C1C}">
+                          <a14:useLocalDpi xmlns:a14="http://schemas.microsoft.com/office/drawing/2010/main" val="0"/>
+                        </a:ext>
+                      </a:extLst>
+                    </a:blip>
+                    <a:srcRect l="76" r="44"/>
+                    <a:stretch>
+                      <a:fillRect/>
+                    </a:stretch>
+                  </pic:blipFill>
+                  <pic:spPr bwMode="auto">
+                    <a:xfrm>
+                      <a:off x="0" y="0"/>
+                      <a:ext cx="6086475" cy="2540635"/>
+                    </a:xfrm>
+                    <a:prstGeom prst="rect">
+                      <a:avLst/>
+                    </a:prstGeom>
+                    <a:ln>
+                      <a:noFill/>
+                    </a:ln>
+                    <a:extLst>
+                      <a:ext uri="{53640926-AAD7-44D8-BBD7-CCE9431645EC}">
+                        <a14:shadowObscured xmlns:a14="http://schemas.microsoft.com/office/drawing/2010/main"/>
+                      </a:ext>
+                    </a:extLst>
+                  </pic:spPr>
+                </pic:pic>
+              </a:graphicData>
+            </a:graphic>
+            <wp14:sizeRelH relativeFrom="margin">
+              <wp14:pctWidth>0</wp14:pctWidth>
+            </wp14:sizeRelH>
+            <wp14:sizeRelV relativeFrom="margin">
+              <wp14:pctHeight>0</wp14:pctHeight>
+            </wp14:sizeRelV>
+          </wp:anchor>
+        </w:drawing>
+      </w:r>
     </w:p>
     <w:p>
       <w:pPr>
@@ -6560,7 +6560,49 @@
           <w:noProof/>
           <w:lang w:val="en-US"/>
         </w:rPr>
-        <w:t xml:space="preserve"> (linear or expontial).</w:t>
+        <w:t xml:space="preserve"> (linear</w:t>
+      </w:r>
+      <w:r>
+        <w:rPr>
+          <w:noProof/>
+          <w:lang w:val="en-US"/>
+        </w:rPr>
+        <w:t>,</w:t>
+      </w:r>
+      <w:r>
+        <w:rPr>
+          <w:noProof/>
+          <w:lang w:val="en-US"/>
+        </w:rPr>
+        <w:t xml:space="preserve"> expon</w:t>
+      </w:r>
+      <w:r>
+        <w:rPr>
+          <w:noProof/>
+          <w:lang w:val="en-US"/>
+        </w:rPr>
+        <w:t>en</w:t>
+      </w:r>
+      <w:r>
+        <w:rPr>
+          <w:noProof/>
+          <w:lang w:val="en-US"/>
+        </w:rPr>
+        <w:t>tial</w:t>
+      </w:r>
+      <w:r>
+        <w:rPr>
+          <w:noProof/>
+          <w:lang w:val="en-US"/>
+        </w:rPr>
+        <w:t xml:space="preserve"> [convex, concave], s-curve</w:t>
+      </w:r>
+      <w:r>
+        <w:rPr>
+          <w:noProof/>
+          <w:lang w:val="en-US"/>
+        </w:rPr>
+        <w:t>).</w:t>
       </w:r>
     </w:p>
     <w:p>

</xml_diff>

<commit_message>
Bugfix: Room presets couldnt be changed on existing rooms & updated manual
</commit_message>
<xml_diff>
--- a/Yaml AudioTool Rebuilt/Resources/Yaml Audio Tool Rebuilt - Manual.docx
+++ b/Yaml AudioTool Rebuilt/Resources/Yaml Audio Tool Rebuilt - Manual.docx
@@ -135,17 +135,7 @@
           <w:szCs w:val="24"/>
           <w:lang w:val="en-US"/>
         </w:rPr>
-        <w:t>6</w:t>
-      </w:r>
-      <w:r>
-        <w:rPr>
-          <w:b/>
-          <w:bCs/>
-          <w:sz w:val="24"/>
-          <w:szCs w:val="24"/>
-          <w:lang w:val="en-US"/>
-        </w:rPr>
-        <w:t>24</w:t>
+        <w:t>712</w:t>
       </w:r>
     </w:p>
     <w:p>
@@ -3472,7 +3462,7 @@
         <w:pStyle w:val="berschrift3"/>
         <w:rPr>
           <w:noProof/>
-          <w:lang w:eastAsia="de-DE"/>
+          <w:lang w:val="en-US" w:eastAsia="de-DE"/>
         </w:rPr>
       </w:pPr>
     </w:p>

</xml_diff>